<commit_message>
docs: Add Supabase auth documentation and update contract template fields
- Add comprehensive Supabase authentication documentation from working reference app
- Update contract template with improved field mappings for KAM and recipient info
- Add backup template for safety

🤖 Generated with [Claude Code](https://claude.com/claude-code)

Co-Authored-By: Claude <noreply@anthropic.com>
</commit_message>
<xml_diff>
--- a/FK COL - GM - Activos.docx
+++ b/FK COL - GM - Activos.docx
@@ -1,6 +1,6 @@
 
 <file path=word/document.xml><?xml version="1.0" encoding="utf-8"?>
-<w:document xmlns:wpc="http://schemas.microsoft.com/office/word/2010/wordprocessingCanvas" xmlns:cx="http://schemas.microsoft.com/office/drawing/2014/chartex" xmlns:cx1="http://schemas.microsoft.com/office/drawing/2015/9/8/chartex" xmlns:cx2="http://schemas.microsoft.com/office/drawing/2015/10/21/chartex" xmlns:cx3="http://schemas.microsoft.com/office/drawing/2016/5/9/chartex" xmlns:cx4="http://schemas.microsoft.com/office/drawing/2016/5/10/chartex" xmlns:cx5="http://schemas.microsoft.com/office/drawing/2016/5/11/chartex" xmlns:cx6="http://schemas.microsoft.com/office/drawing/2016/5/12/chartex" xmlns:cx7="http://schemas.microsoft.com/office/drawing/2016/5/13/chartex" xmlns:cx8="http://schemas.microsoft.com/office/drawing/2016/5/14/chartex" xmlns:mc="http://schemas.openxmlformats.org/markup-compatibility/2006" xmlns:aink="http://schemas.microsoft.com/office/drawing/2016/ink" xmlns:am3d="http://schemas.microsoft.com/office/drawing/2017/model3d" xmlns:o="urn:schemas-microsoft-com:office:office" xmlns:oel="http://schemas.microsoft.com/office/2019/extlst" xmlns:r="http://schemas.openxmlformats.org/officeDocument/2006/relationships" xmlns:m="http://schemas.openxmlformats.org/officeDocument/2006/math" xmlns:v="urn:schemas-microsoft-com:vml" xmlns:wp14="http://schemas.microsoft.com/office/word/2010/wordprocessingDrawing" xmlns:wp="http://schemas.openxmlformats.org/drawingml/2006/wordprocessingDrawing" xmlns:w10="urn:schemas-microsoft-com:office:word" xmlns:w="http://schemas.openxmlformats.org/wordprocessingml/2006/main" xmlns:w14="http://schemas.microsoft.com/office/word/2010/wordml" xmlns:w15="http://schemas.microsoft.com/office/word/2012/wordml" xmlns:w16cex="http://schemas.microsoft.com/office/word/2018/wordml/cex" xmlns:w16cid="http://schemas.microsoft.com/office/word/2016/wordml/cid" xmlns:w16="http://schemas.microsoft.com/office/word/2018/wordml" xmlns:w16du="http://schemas.microsoft.com/office/word/2023/wordml/word16du" xmlns:w16sdtdh="http://schemas.microsoft.com/office/word/2020/wordml/sdtdatahash" xmlns:w16sdtfl="http://schemas.microsoft.com/office/word/2024/wordml/sdtformatlock" xmlns:w16se="http://schemas.microsoft.com/office/word/2015/wordml/symex" xmlns:wpg="http://schemas.microsoft.com/office/word/2010/wordprocessingGroup" xmlns:wpi="http://schemas.microsoft.com/office/word/2010/wordprocessingInk" xmlns:wne="http://schemas.microsoft.com/office/word/2006/wordml" xmlns:wps="http://schemas.microsoft.com/office/word/2010/wordprocessingShape" mc:Ignorable="w14 w15 w16se w16cid w16 w16cex w16sdtdh w16sdtfl w16du wp14">
+<w:document xmlns:wpc="http://schemas.microsoft.com/office/word/2010/wordprocessingCanvas" xmlns:cx="http://schemas.microsoft.com/office/drawing/2014/chartex" xmlns:cx1="http://schemas.microsoft.com/office/drawing/2015/9/8/chartex" xmlns:cx2="http://schemas.microsoft.com/office/drawing/2015/10/21/chartex" xmlns:cx3="http://schemas.microsoft.com/office/drawing/2016/5/9/chartex" xmlns:cx4="http://schemas.microsoft.com/office/drawing/2016/5/10/chartex" xmlns:cx5="http://schemas.microsoft.com/office/drawing/2016/5/11/chartex" xmlns:cx6="http://schemas.microsoft.com/office/drawing/2016/5/12/chartex" xmlns:cx7="http://schemas.microsoft.com/office/drawing/2016/5/13/chartex" xmlns:cx8="http://schemas.microsoft.com/office/drawing/2016/5/14/chartex" xmlns:mc="http://schemas.openxmlformats.org/markup-compatibility/2006" xmlns:aink="http://schemas.microsoft.com/office/drawing/2016/ink" xmlns:am3d="http://schemas.microsoft.com/office/drawing/2017/model3d" xmlns:o="urn:schemas-microsoft-com:office:office" xmlns:r="http://schemas.openxmlformats.org/officeDocument/2006/relationships" xmlns:m="http://schemas.openxmlformats.org/officeDocument/2006/math" xmlns:v="urn:schemas-microsoft-com:vml" xmlns:wp14="http://schemas.microsoft.com/office/word/2010/wordprocessingDrawing" xmlns:wp="http://schemas.openxmlformats.org/drawingml/2006/wordprocessingDrawing" xmlns:w10="urn:schemas-microsoft-com:office:word" xmlns:w="http://schemas.openxmlformats.org/wordprocessingml/2006/main" xmlns:w14="http://schemas.microsoft.com/office/word/2010/wordml" xmlns:w15="http://schemas.microsoft.com/office/word/2012/wordml" xmlns:w16cex="http://schemas.microsoft.com/office/word/2018/wordml/cex" xmlns:w16cid="http://schemas.microsoft.com/office/word/2016/wordml/cid" xmlns:w16="http://schemas.microsoft.com/office/word/2018/wordml" xmlns:w16se="http://schemas.microsoft.com/office/word/2015/wordml/symex" xmlns:wpg="http://schemas.microsoft.com/office/word/2010/wordprocessingGroup" xmlns:wpi="http://schemas.microsoft.com/office/word/2010/wordprocessingInk" xmlns:wne="http://schemas.microsoft.com/office/word/2006/wordml" xmlns:wps="http://schemas.microsoft.com/office/word/2010/wordprocessingShape" mc:Ignorable="w14 w15 w16se w16cid w16 w16cex wp14">
   <w:body>
     <w:p>
       <w:pPr>
@@ -213,7 +213,7 @@
     </w:p>
     <w:p>
       <w:pPr>
-        <w:pStyle w:val="Prrafodelista"/>
+        <w:pStyle w:val="ListParagraph"/>
         <w:numPr>
           <w:ilvl w:val="0"/>
           <w:numId w:val="2"/>
@@ -280,21 +280,7 @@
         <w:rPr>
           <w:lang w:val="es-CO"/>
         </w:rPr>
-        <w:t xml:space="preserve"> en la ciudad de Bogotá D.C., identificada con NIT 901.456.364–1, y representada para todos los efectos de este Contrato por John Elvis Jiménez </w:t>
-      </w:r>
-      <w:proofErr w:type="spellStart"/>
-      <w:r>
-        <w:rPr>
-          <w:lang w:val="es-CO"/>
-        </w:rPr>
-        <w:t>Jiménez</w:t>
-      </w:r>
-      <w:proofErr w:type="spellEnd"/>
-      <w:r>
-        <w:rPr>
-          <w:lang w:val="es-CO"/>
-        </w:rPr>
-        <w:t>, ide</w:t>
+        <w:t xml:space="preserve"> en la ciudad de Bogotá D.C., identificada con NIT 901.456.364–1, y representada para todos los efectos de este Contrato por John Elvis Jiménez Jiménez, ide</w:t>
       </w:r>
       <w:r>
         <w:rPr>
@@ -334,7 +320,7 @@
     <w:bookmarkEnd w:id="3"/>
     <w:p>
       <w:pPr>
-        <w:pStyle w:val="Prrafodelista"/>
+        <w:pStyle w:val="ListParagraph"/>
         <w:numPr>
           <w:ilvl w:val="0"/>
           <w:numId w:val="2"/>
@@ -1108,21 +1094,7 @@
         <w:rPr>
           <w:lang w:val="es-CO"/>
         </w:rPr>
-        <w:t xml:space="preserve">] (según el mismo sea </w:t>
-      </w:r>
-      <w:proofErr w:type="spellStart"/>
-      <w:r>
-        <w:rPr>
-          <w:lang w:val="es-CO"/>
-        </w:rPr>
-        <w:t>re-expresado</w:t>
-      </w:r>
-      <w:proofErr w:type="spellEnd"/>
-      <w:r>
-        <w:rPr>
-          <w:lang w:val="es-CO"/>
-        </w:rPr>
-        <w:t>, suplementado, adicionado o de cualquier otra forma modificado) en virtud del cual</w:t>
+        <w:t>] (según el mismo sea re-expresado, suplementado, adicionado o de cualquier otra forma modificado) en virtud del cual</w:t>
       </w:r>
       <w:r>
         <w:rPr>
@@ -1433,7 +1405,7 @@
     </w:p>
     <w:p>
       <w:pPr>
-        <w:pStyle w:val="Ttulo1"/>
+        <w:pStyle w:val="Heading1"/>
         <w:jc w:val="center"/>
         <w:rPr>
           <w:lang w:val="es-CO"/>
@@ -1466,7 +1438,7 @@
     </w:p>
     <w:p>
       <w:pPr>
-        <w:pStyle w:val="Ttulo2"/>
+        <w:pStyle w:val="Heading2"/>
         <w:rPr>
           <w:vanish/>
           <w:lang w:val="es-CO"/>
@@ -1512,7 +1484,7 @@
     </w:p>
     <w:p>
       <w:pPr>
-        <w:pStyle w:val="Ttulo3"/>
+        <w:pStyle w:val="Heading3"/>
       </w:pPr>
       <w:r>
         <w:t xml:space="preserve">Los términos con mayúscula inicial serán igualmente aplicables en singular y en plural. Las palabras “incluyendo”, “incluye” e “incluir” se considerarán seguidas de la frase “sin limitación alguna”. </w:t>
@@ -1525,7 +1497,7 @@
     </w:p>
     <w:p>
       <w:pPr>
-        <w:pStyle w:val="Ttulo3"/>
+        <w:pStyle w:val="Heading3"/>
       </w:pPr>
       <w:r>
         <w:t xml:space="preserve">Una referencia a una </w:t>
@@ -1554,7 +1526,7 @@
     </w:p>
     <w:p>
       <w:pPr>
-        <w:pStyle w:val="Ttulo3"/>
+        <w:pStyle w:val="Heading3"/>
       </w:pPr>
       <w:r>
         <w:t xml:space="preserve">Las referencias a este Contrato o a cualquier otro contrato </w:t>
@@ -1607,7 +1579,7 @@
     </w:p>
     <w:p>
       <w:pPr>
-        <w:pStyle w:val="Ttulo3"/>
+        <w:pStyle w:val="Heading3"/>
       </w:pPr>
       <w:r>
         <w:t>Las referencias a las Leyes Aplicables incluyen todas las Leyes Aplicables o disposiciones legales, tal y como hayan sido modificadas, adicionadas o remplazadas en cualquier momento</w:t>
@@ -1618,7 +1590,7 @@
     </w:p>
     <w:p>
       <w:pPr>
-        <w:pStyle w:val="Ttulo3"/>
+        <w:pStyle w:val="Heading3"/>
       </w:pPr>
       <w:bookmarkStart w:id="11" w:name="_Hlk131636226"/>
       <w:r>
@@ -1637,17 +1609,12 @@
         <w:t xml:space="preserve"> Contrato</w:t>
       </w:r>
       <w:r>
-        <w:t xml:space="preserve"> y sus Anexos antes de su suscripción y antes de obligarse en los términos </w:t>
-      </w:r>
-      <w:proofErr w:type="gramStart"/>
-      <w:r>
-        <w:t xml:space="preserve">del </w:t>
+        <w:t xml:space="preserve"> y sus Anexos antes de su suscripción y antes de obligarse en los términos del </w:t>
       </w:r>
       <w:r>
         <w:t>mismo</w:t>
       </w:r>
       <w:bookmarkEnd w:id="11"/>
-      <w:proofErr w:type="gramEnd"/>
       <w:r>
         <w:t xml:space="preserve">. En caso de ambigüedad o duda en relación con la intención o interpretación de cualquier disposición de este </w:t>
       </w:r>
@@ -1658,7 +1625,7 @@
     </w:p>
     <w:p>
       <w:pPr>
-        <w:pStyle w:val="Ttulo2"/>
+        <w:pStyle w:val="Heading2"/>
         <w:rPr>
           <w:vanish/>
           <w:u w:val="none"/>
@@ -1907,19 +1874,11 @@
       <w:r>
         <w:t>“</w:t>
       </w:r>
-      <w:proofErr w:type="spellStart"/>
-      <w:r>
-        <w:rPr>
-          <w:u w:val="single"/>
-        </w:rPr>
-        <w:t>Avaluador</w:t>
-      </w:r>
-      <w:proofErr w:type="spellEnd"/>
-      <w:r>
-        <w:rPr>
-          <w:u w:val="single"/>
-        </w:rPr>
-        <w:t xml:space="preserve"> Independiente</w:t>
+      <w:r>
+        <w:rPr>
+          <w:u w:val="single"/>
+        </w:rPr>
+        <w:t>Avaluador Independiente</w:t>
       </w:r>
       <w:r>
         <w:t>” significa una Persona que (a) cumple con los Criterios de Independencia y Experiencia; (b) tenga domicilio principal o una oficina de representación en Colombia; y (c) cuyo objeto social consista en la realización de actividades de valoración de activos y empresas.</w:t>
@@ -2181,76 +2140,26 @@
         </w:rPr>
         <w:t xml:space="preserve">” significa </w:t>
       </w:r>
-      <w:proofErr w:type="spellStart"/>
       <w:r>
         <w:rPr>
           <w:i/>
           <w:lang w:val="es-CO"/>
         </w:rPr>
-        <w:t>bill</w:t>
-      </w:r>
-      <w:proofErr w:type="spellEnd"/>
+        <w:t>bill of lading,</w:t>
+      </w:r>
+      <w:r>
+        <w:rPr>
+          <w:lang w:val="es-CO"/>
+        </w:rPr>
+        <w:t xml:space="preserve"> carta porte, conocimiento de embarque o </w:t>
+      </w:r>
       <w:r>
         <w:rPr>
           <w:i/>
           <w:lang w:val="es-CO"/>
         </w:rPr>
-        <w:t xml:space="preserve"> </w:t>
-      </w:r>
-      <w:proofErr w:type="spellStart"/>
-      <w:r>
-        <w:rPr>
-          <w:i/>
-          <w:lang w:val="es-CO"/>
-        </w:rPr>
-        <w:t>of</w:t>
-      </w:r>
-      <w:proofErr w:type="spellEnd"/>
-      <w:r>
-        <w:rPr>
-          <w:i/>
-          <w:lang w:val="es-CO"/>
-        </w:rPr>
-        <w:t xml:space="preserve"> </w:t>
-      </w:r>
-      <w:proofErr w:type="spellStart"/>
-      <w:r>
-        <w:rPr>
-          <w:i/>
-          <w:lang w:val="es-CO"/>
-        </w:rPr>
-        <w:t>lading</w:t>
-      </w:r>
-      <w:proofErr w:type="spellEnd"/>
-      <w:r>
-        <w:rPr>
-          <w:i/>
-          <w:lang w:val="es-CO"/>
-        </w:rPr>
-        <w:t>,</w:t>
-      </w:r>
-      <w:r>
-        <w:rPr>
-          <w:lang w:val="es-CO"/>
-        </w:rPr>
-        <w:t xml:space="preserve"> carta porte, conocimiento de embarque o </w:t>
-      </w:r>
-      <w:r>
-        <w:rPr>
-          <w:i/>
-          <w:lang w:val="es-CO"/>
-        </w:rPr>
-        <w:t xml:space="preserve">air </w:t>
-      </w:r>
-      <w:proofErr w:type="spellStart"/>
-      <w:r>
-        <w:rPr>
-          <w:i/>
-          <w:lang w:val="es-CO"/>
-        </w:rPr>
-        <w:t>bill</w:t>
-      </w:r>
-      <w:proofErr w:type="spellEnd"/>
+        <w:t>air bill</w:t>
+      </w:r>
       <w:r>
         <w:rPr>
           <w:lang w:val="es-CO"/>
@@ -2787,14 +2696,12 @@
       <w:r>
         <w:t xml:space="preserve">” significa la venta, transferencia, cesión, arrendamiento o cualquier otra disposición (incluyendo operaciones de </w:t>
       </w:r>
-      <w:proofErr w:type="spellStart"/>
       <w:r>
         <w:rPr>
           <w:i/>
         </w:rPr>
         <w:t>leaseback</w:t>
       </w:r>
-      <w:proofErr w:type="spellEnd"/>
       <w:r>
         <w:t xml:space="preserve">), de la propiedad de cualquier Persona, incluyendo la venta, cesión, transferencia o cualquier otra </w:t>
       </w:r>
@@ -2879,7 +2786,6 @@
         <w:lastRenderedPageBreak/>
         <w:t>“</w:t>
       </w:r>
-      <w:proofErr w:type="gramStart"/>
       <w:r>
         <w:rPr>
           <w:u w:val="single"/>
@@ -2887,7 +2793,6 @@
         </w:rPr>
         <w:t>Dólares</w:t>
       </w:r>
-      <w:proofErr w:type="gramEnd"/>
       <w:r>
         <w:rPr>
           <w:lang w:val="es-CO"/>
@@ -3114,16 +3019,8 @@
         <w:rPr>
           <w:u w:val="single"/>
         </w:rPr>
-        <w:t xml:space="preserve">Finkargo </w:t>
-      </w:r>
-      <w:proofErr w:type="spellStart"/>
-      <w:r>
-        <w:rPr>
-          <w:u w:val="single"/>
-        </w:rPr>
-        <w:t>Abroad</w:t>
-      </w:r>
-      <w:proofErr w:type="spellEnd"/>
+        <w:t>Finkargo Abroad</w:t>
+      </w:r>
       <w:r>
         <w:t xml:space="preserve">” significa cualquier Afiliada </w:t>
       </w:r>
@@ -3576,14 +3473,12 @@
         </w:rPr>
         <w:t xml:space="preserve"> y (</w:t>
       </w:r>
-      <w:proofErr w:type="spellStart"/>
       <w:r>
         <w:rPr>
           <w:lang w:val="es-CO"/>
         </w:rPr>
         <w:t>iii</w:t>
       </w:r>
-      <w:proofErr w:type="spellEnd"/>
       <w:r>
         <w:rPr>
           <w:lang w:val="es-CO"/>
@@ -4701,14 +4596,14 @@
       <w:hyperlink r:id="rId9" w:history="1">
         <w:r>
           <w:rPr>
-            <w:rStyle w:val="Hipervnculo"/>
+            <w:rStyle w:val="Hyperlink"/>
           </w:rPr>
           <w:t>www.finkargo.com</w:t>
         </w:r>
       </w:hyperlink>
       <w:r>
         <w:rPr>
-          <w:rStyle w:val="Hipervnculo"/>
+          <w:rStyle w:val="Hyperlink"/>
         </w:rPr>
         <w:t xml:space="preserve"> </w:t>
       </w:r>
@@ -4800,23 +4695,7 @@
           <w:u w:val="single"/>
           <w:lang w:val="es-CO"/>
         </w:rPr>
-        <w:t>Sección 8.05(b)(</w:t>
-      </w:r>
-      <w:proofErr w:type="spellStart"/>
-      <w:r>
-        <w:rPr>
-          <w:u w:val="single"/>
-          <w:lang w:val="es-CO"/>
-        </w:rPr>
-        <w:t>iii</w:t>
-      </w:r>
-      <w:proofErr w:type="spellEnd"/>
-      <w:r>
-        <w:rPr>
-          <w:u w:val="single"/>
-          <w:lang w:val="es-CO"/>
-        </w:rPr>
-        <w:t>)(1)</w:t>
+        <w:t>Sección 8.05(b)(iii)(1)</w:t>
       </w:r>
       <w:r>
         <w:rPr>
@@ -5026,15 +4905,7 @@
         <w:t>.</w:t>
       </w:r>
       <w:r>
-        <w:t xml:space="preserve"> Para efectos de este Contrato, se entiende que el Proveedor podrá ser Finkargo </w:t>
-      </w:r>
-      <w:proofErr w:type="spellStart"/>
-      <w:r>
-        <w:t>Abroad</w:t>
-      </w:r>
-      <w:proofErr w:type="spellEnd"/>
-      <w:r>
-        <w:t>.</w:t>
+        <w:t xml:space="preserve"> Para efectos de este Contrato, se entiende que el Proveedor podrá ser Finkargo Abroad.</w:t>
       </w:r>
     </w:p>
     <w:p>
@@ -5435,20 +5306,12 @@
         <w:t>TRM</w:t>
       </w:r>
       <w:r>
-        <w:t xml:space="preserve">” significa la tasa de cambio representativa del mercado para determinar la cantidad de Pesos equivalentes a un </w:t>
-      </w:r>
-      <w:proofErr w:type="gramStart"/>
-      <w:r>
-        <w:t>Dólar</w:t>
-      </w:r>
-      <w:proofErr w:type="gramEnd"/>
-      <w:r>
-        <w:t>, calculada y certificada diariamente por la Superintendencia Financiera de Colombia (o por quien haga sus veces) y publicada diariamente en su página web(</w:t>
+        <w:t>” significa la tasa de cambio representativa del mercado para determinar la cantidad de Pesos equivalentes a un Dólar, calculada y certificada diariamente por la Superintendencia Financiera de Colombia (o por quien haga sus veces) y publicada diariamente en su página web(</w:t>
       </w:r>
       <w:hyperlink r:id="rId10" w:history="1">
         <w:r>
           <w:rPr>
-            <w:rStyle w:val="Hipervnculo"/>
+            <w:rStyle w:val="Hyperlink"/>
           </w:rPr>
           <w:t>www.superfinanciera.gov.co</w:t>
         </w:r>
@@ -5658,7 +5521,7 @@
     </w:p>
     <w:p>
       <w:pPr>
-        <w:pStyle w:val="Ttulo1"/>
+        <w:pStyle w:val="Heading1"/>
         <w:jc w:val="center"/>
         <w:rPr>
           <w:lang w:val="es-CO"/>
@@ -5698,7 +5561,7 @@
     </w:p>
     <w:p>
       <w:pPr>
-        <w:pStyle w:val="Ttulo2"/>
+        <w:pStyle w:val="Heading2"/>
         <w:rPr>
           <w:vanish/>
           <w:lang w:val="es-CO"/>
@@ -5736,7 +5599,7 @@
     </w:p>
     <w:p>
       <w:pPr>
-        <w:pStyle w:val="Ttulo3"/>
+        <w:pStyle w:val="Heading3"/>
       </w:pPr>
       <w:bookmarkStart w:id="33" w:name="_Ref129809229"/>
       <w:bookmarkStart w:id="34" w:name="_Ref136365270"/>
@@ -5809,7 +5672,7 @@
     </w:p>
     <w:p>
       <w:pPr>
-        <w:pStyle w:val="Ttulo3"/>
+        <w:pStyle w:val="Heading3"/>
       </w:pPr>
       <w:r>
         <w:t xml:space="preserve">En ningún caso y </w:t>
@@ -5832,7 +5695,7 @@
     </w:p>
     <w:p>
       <w:pPr>
-        <w:pStyle w:val="Ttulo2"/>
+        <w:pStyle w:val="Heading2"/>
         <w:rPr>
           <w:vanish/>
           <w:specVanish/>
@@ -5939,7 +5802,7 @@
     </w:p>
     <w:p>
       <w:pPr>
-        <w:pStyle w:val="Ttulo1"/>
+        <w:pStyle w:val="Heading1"/>
         <w:jc w:val="center"/>
       </w:pPr>
       <w:r>
@@ -5957,7 +5820,7 @@
     </w:p>
     <w:p>
       <w:pPr>
-        <w:pStyle w:val="Ttulo2"/>
+        <w:pStyle w:val="Heading2"/>
         <w:rPr>
           <w:vanish/>
           <w:lang w:val="es-CO"/>
@@ -6236,7 +6099,7 @@
           </w:p>
           <w:p>
             <w:pPr>
-              <w:pStyle w:val="Ttulo3"/>
+              <w:pStyle w:val="Heading3"/>
               <w:numPr>
                 <w:ilvl w:val="2"/>
                 <w:numId w:val="33"/>
@@ -6276,7 +6139,7 @@
           </w:p>
           <w:p>
             <w:pPr>
-              <w:pStyle w:val="Ttulo3"/>
+              <w:pStyle w:val="Heading3"/>
               <w:numPr>
                 <w:ilvl w:val="2"/>
                 <w:numId w:val="33"/>
@@ -6354,21 +6217,7 @@
               <w:rPr>
                 <w:lang w:val="es-ES_tradnl"/>
               </w:rPr>
-              <w:t xml:space="preserve"> en virtud del Contrato Marco, incluyendo pero sin limitarse al pago de todas las sumas por concepto de comisiones, capital, cualquier clase de intereses, honorarios, otros costos y gastos, gastos de cobranza judicial y extrajudicial, obligaciones de indemnización y cualesquiera otras obligaciones (según las mismas sean adicionadas, </w:t>
-            </w:r>
-            <w:proofErr w:type="spellStart"/>
-            <w:r>
-              <w:rPr>
-                <w:lang w:val="es-ES_tradnl"/>
-              </w:rPr>
-              <w:t>re-expresadas</w:t>
-            </w:r>
-            <w:proofErr w:type="spellEnd"/>
-            <w:r>
-              <w:rPr>
-                <w:lang w:val="es-ES_tradnl"/>
-              </w:rPr>
-              <w:t>, completadas o de cualquier otra forma modificadas) actuales o que en el futuro llegaren a generarse a cargo del Importador en virtud del Contrato Marco, estén o no respaldados por títulos valores o hubieren sido contraídas a través de cualquier acto o instrumento, en su vencimiento, ya sea según vencimiento expreso, mediante el pago anticipado requerido, declaración, aceleración, exigencia o de cualquier otro modo (conjuntamente, las “</w:t>
+              <w:t xml:space="preserve"> en virtud del Contrato Marco, incluyendo pero sin limitarse al pago de todas las sumas por concepto de comisiones, capital, cualquier clase de intereses, honorarios, otros costos y gastos, gastos de cobranza judicial y extrajudicial, obligaciones de indemnización y cualesquiera otras obligaciones (según las mismas sean adicionadas, re-expresadas, completadas o de cualquier otra forma modificadas) actuales o que en el futuro llegaren a generarse a cargo del Importador en virtud del Contrato Marco, estén o no respaldados por títulos valores o hubieren sido contraídas a través de cualquier acto o instrumento, en su vencimiento, ya sea según vencimiento expreso, mediante el pago anticipado requerido, declaración, aceleración, exigencia o de cualquier otro modo (conjuntamente, las “</w:t>
             </w:r>
             <w:r>
               <w:rPr>
@@ -6713,7 +6562,7 @@
     </w:p>
     <w:p>
       <w:pPr>
-        <w:pStyle w:val="Ttulo2"/>
+        <w:pStyle w:val="Heading2"/>
         <w:rPr>
           <w:vanish/>
           <w:specVanish/>
@@ -6751,7 +6600,7 @@
     </w:p>
     <w:p>
       <w:pPr>
-        <w:pStyle w:val="Ttulo3"/>
+        <w:pStyle w:val="Heading3"/>
       </w:pPr>
       <w:r>
         <w:t xml:space="preserve">Cualquier renovación, </w:t>
@@ -6804,7 +6653,7 @@
     </w:p>
     <w:p>
       <w:pPr>
-        <w:pStyle w:val="Ttulo3"/>
+        <w:pStyle w:val="Heading3"/>
         <w:rPr>
           <w:lang w:val="es-MX"/>
         </w:rPr>
@@ -6827,7 +6676,7 @@
     </w:p>
     <w:p>
       <w:pPr>
-        <w:pStyle w:val="Ttulo3"/>
+        <w:pStyle w:val="Heading3"/>
       </w:pPr>
       <w:r>
         <w:t>Cualquier sustitución, venta, cesión, intercambio, liberación, rendición o</w:t>
@@ -6874,7 +6723,7 @@
     </w:p>
     <w:p>
       <w:pPr>
-        <w:pStyle w:val="Ttulo3"/>
+        <w:pStyle w:val="Heading3"/>
       </w:pPr>
       <w:r>
         <w:t xml:space="preserve">Salvo expresamente aceptado por </w:t>
@@ -6885,7 +6734,7 @@
     </w:p>
     <w:p>
       <w:pPr>
-        <w:pStyle w:val="Ttulo3"/>
+        <w:pStyle w:val="Heading3"/>
       </w:pPr>
       <w:r>
         <w:t xml:space="preserve"> en el marco del Remplazo de la Garantía</w:t>
@@ -6923,7 +6772,7 @@
     </w:p>
     <w:p>
       <w:pPr>
-        <w:pStyle w:val="Ttulo3"/>
+        <w:pStyle w:val="Heading3"/>
       </w:pPr>
       <w:r>
         <w:t xml:space="preserve">El </w:t>
@@ -6946,7 +6795,7 @@
     </w:p>
     <w:p>
       <w:pPr>
-        <w:pStyle w:val="Ttulo3"/>
+        <w:pStyle w:val="Heading3"/>
       </w:pPr>
       <w:r>
         <w:lastRenderedPageBreak/>
@@ -6958,7 +6807,7 @@
     </w:p>
     <w:p>
       <w:pPr>
-        <w:pStyle w:val="Ttulo1"/>
+        <w:pStyle w:val="Heading1"/>
         <w:jc w:val="center"/>
       </w:pPr>
       <w:r>
@@ -6973,7 +6822,7 @@
     </w:p>
     <w:p>
       <w:pPr>
-        <w:pStyle w:val="Ttulo2"/>
+        <w:pStyle w:val="Heading2"/>
         <w:rPr>
           <w:vanish/>
           <w:specVanish/>
@@ -7027,7 +6876,7 @@
     </w:p>
     <w:p>
       <w:pPr>
-        <w:pStyle w:val="Ttulo2"/>
+        <w:pStyle w:val="Heading2"/>
         <w:rPr>
           <w:vanish/>
           <w:specVanish/>
@@ -7050,7 +6899,7 @@
     </w:p>
     <w:p>
       <w:pPr>
-        <w:pStyle w:val="Ttulo3"/>
+        <w:pStyle w:val="Heading3"/>
         <w:tabs>
           <w:tab w:val="num" w:pos="1418"/>
         </w:tabs>
@@ -7088,18 +6937,16 @@
       <w:r>
         <w:t>(</w:t>
       </w:r>
-      <w:proofErr w:type="spellStart"/>
       <w:r>
         <w:t>iii</w:t>
       </w:r>
-      <w:proofErr w:type="spellEnd"/>
       <w:r>
         <w:t>) realizar y finalizar todas las acciones necesarias para mantener los Bienes en Garantía en buenas condiciones de funcionamiento y de servicio, exceptuando el deterioro normal por el uso de los Bienes en Garantía.</w:t>
       </w:r>
     </w:p>
     <w:p>
       <w:pPr>
-        <w:pStyle w:val="Ttulo3"/>
+        <w:pStyle w:val="Heading3"/>
         <w:tabs>
           <w:tab w:val="num" w:pos="1418"/>
         </w:tabs>
@@ -7293,7 +7140,7 @@
     </w:p>
     <w:p>
       <w:pPr>
-        <w:pStyle w:val="Ttulo3"/>
+        <w:pStyle w:val="Heading3"/>
         <w:tabs>
           <w:tab w:val="num" w:pos="1418"/>
         </w:tabs>
@@ -7322,19 +7169,15 @@
       <w:r>
         <w:t>) en relación con los activos del Importador que en desarrollo de sus actividades ordinarias sea necesario trasladar o que el Importador determine en el giro ordinario de sus negocios que es conveniente trasladar; (</w:t>
       </w:r>
-      <w:proofErr w:type="spellStart"/>
       <w:r>
         <w:t>iii</w:t>
       </w:r>
-      <w:proofErr w:type="spellEnd"/>
       <w:r>
         <w:t>) en relación con aquellos Bienes en Garantía que por su naturaleza puedan ser trasladados temporalmente a cualquier lugar del territorio de Colombia dentro del giro ordinario de las actividades del Importador; y (</w:t>
       </w:r>
-      <w:proofErr w:type="spellStart"/>
       <w:r>
         <w:t>iv</w:t>
       </w:r>
-      <w:proofErr w:type="spellEnd"/>
       <w:r>
         <w:t>) para el traslado de los activos que sea necesario trasladar fuera de las instalaciones del Importador para efectos de su reparación, mantenimiento o reemplazo, traslado que queda autorizado expresamente por este Contrato, teniendo en cuenta que los bienes así trasladados serán retomados por el Importador una vez sean reparados, mantenidos o remplazados.</w:t>
       </w:r>
@@ -7342,7 +7185,7 @@
     </w:p>
     <w:p>
       <w:pPr>
-        <w:pStyle w:val="Ttulo2"/>
+        <w:pStyle w:val="Heading2"/>
         <w:rPr>
           <w:vanish/>
           <w:lang w:val="es-CO"/>
@@ -7363,7 +7206,7 @@
     </w:p>
     <w:p>
       <w:pPr>
-        <w:pStyle w:val="Ttulo3"/>
+        <w:pStyle w:val="Heading3"/>
       </w:pPr>
       <w:bookmarkStart w:id="43" w:name="_Ref133468637"/>
       <w:r>
@@ -7413,7 +7256,7 @@
     </w:p>
     <w:p>
       <w:pPr>
-        <w:pStyle w:val="Ttulo3"/>
+        <w:pStyle w:val="Heading3"/>
       </w:pPr>
       <w:r>
         <w:t xml:space="preserve">No obstante lo anterior, ante la ocurrencia de un Evento de Incumplimiento y mientras éste continúe, </w:t>
@@ -7500,7 +7343,7 @@
     </w:p>
     <w:p>
       <w:pPr>
-        <w:pStyle w:val="Ttulo1"/>
+        <w:pStyle w:val="Heading1"/>
         <w:jc w:val="center"/>
         <w:rPr>
           <w:lang w:val="es-CO"/>
@@ -7544,7 +7387,7 @@
     </w:p>
     <w:p>
       <w:pPr>
-        <w:pStyle w:val="Ttulo2"/>
+        <w:pStyle w:val="Heading2"/>
         <w:rPr>
           <w:vanish/>
           <w:lang w:val="es-CO"/>
@@ -7589,7 +7432,7 @@
     </w:p>
     <w:p>
       <w:pPr>
-        <w:pStyle w:val="Ttulo3"/>
+        <w:pStyle w:val="Heading3"/>
       </w:pPr>
       <w:r>
         <w:t xml:space="preserve">El Importador acepta, reconoce y autoriza a </w:t>
@@ -7627,7 +7470,7 @@
     </w:p>
     <w:p>
       <w:pPr>
-        <w:pStyle w:val="Ttulo3"/>
+        <w:pStyle w:val="Heading3"/>
       </w:pPr>
       <w:r>
         <w:t>Para estos efectos (</w:t>
@@ -7689,7 +7532,7 @@
     </w:p>
     <w:p>
       <w:pPr>
-        <w:pStyle w:val="Ttulo2"/>
+        <w:pStyle w:val="Heading2"/>
         <w:rPr>
           <w:vanish/>
           <w:specVanish/>
@@ -7706,7 +7549,7 @@
     </w:p>
     <w:p>
       <w:pPr>
-        <w:pStyle w:val="Ttulo3"/>
+        <w:pStyle w:val="Heading3"/>
       </w:pPr>
       <w:r>
         <w:t>El Importador acepta expresamente que no podrá solicitar la cancelación parcial o modificación de</w:t>
@@ -7726,7 +7569,7 @@
     </w:p>
     <w:p>
       <w:pPr>
-        <w:pStyle w:val="Ttulo3"/>
+        <w:pStyle w:val="Heading3"/>
       </w:pPr>
       <w:r>
         <w:t>Esta</w:t>
@@ -7779,7 +7622,7 @@
     </w:p>
     <w:p>
       <w:pPr>
-        <w:pStyle w:val="Ttulo3"/>
+        <w:pStyle w:val="Heading3"/>
       </w:pPr>
       <w:r>
         <w:t xml:space="preserve">En la medida en que existieren saldos pendientes de pago de las Obligaciones Garantizadas, el Importador acepta, reconoce y autoriza a </w:t>
@@ -7850,7 +7693,7 @@
     </w:p>
     <w:p>
       <w:pPr>
-        <w:pStyle w:val="Ttulo3"/>
+        <w:pStyle w:val="Heading3"/>
       </w:pPr>
       <w:r>
         <w:t xml:space="preserve">El Importador acepta y reconoce que cualquier gasto o costo derivado de la presente </w:t>
@@ -7908,7 +7751,7 @@
     </w:p>
     <w:p>
       <w:pPr>
-        <w:pStyle w:val="Ttulo1"/>
+        <w:pStyle w:val="Heading1"/>
         <w:jc w:val="center"/>
         <w:rPr>
           <w:lang w:val="es-CO"/>
@@ -7938,7 +7781,7 @@
     </w:p>
     <w:p>
       <w:pPr>
-        <w:pStyle w:val="Ttulo2"/>
+        <w:pStyle w:val="Heading2"/>
         <w:rPr>
           <w:vanish/>
           <w:lang w:val="es-CO"/>
@@ -8014,7 +7857,7 @@
     </w:p>
     <w:p>
       <w:pPr>
-        <w:pStyle w:val="Ttulo3"/>
+        <w:pStyle w:val="Heading3"/>
       </w:pPr>
       <w:r>
         <w:t xml:space="preserve">El Importador </w:t>
@@ -8034,7 +7877,7 @@
     </w:p>
     <w:p>
       <w:pPr>
-        <w:pStyle w:val="Ttulo3"/>
+        <w:pStyle w:val="Heading3"/>
       </w:pPr>
       <w:r>
         <w:t xml:space="preserve">El Importador </w:t>
@@ -8048,7 +7891,7 @@
     </w:p>
     <w:p>
       <w:pPr>
-        <w:pStyle w:val="Ttulo3"/>
+        <w:pStyle w:val="Heading3"/>
       </w:pPr>
       <w:r>
         <w:t xml:space="preserve">La </w:t>
@@ -8080,7 +7923,7 @@
     </w:p>
     <w:p>
       <w:pPr>
-        <w:pStyle w:val="Ttulo3"/>
+        <w:pStyle w:val="Heading3"/>
       </w:pPr>
       <w:r>
         <w:t>El Importador es Solvente.</w:t>
@@ -8088,7 +7931,7 @@
     </w:p>
     <w:p>
       <w:pPr>
-        <w:pStyle w:val="Ttulo3"/>
+        <w:pStyle w:val="Heading3"/>
       </w:pPr>
       <w:r>
         <w:t>T</w:t>
@@ -8147,7 +7990,7 @@
     </w:p>
     <w:p>
       <w:pPr>
-        <w:pStyle w:val="Ttulo3"/>
+        <w:pStyle w:val="Heading3"/>
       </w:pPr>
       <w:r>
         <w:t>El Importador tiene y tendrá en todo momento</w:t>
@@ -8203,7 +8046,7 @@
     </w:p>
     <w:p>
       <w:pPr>
-        <w:pStyle w:val="Ttulo3"/>
+        <w:pStyle w:val="Heading3"/>
       </w:pPr>
       <w:r>
         <w:t xml:space="preserve">El Importador no ha constituido ni constituirá mientras se encuentren pendientes las Obligaciones Garantizadas una garantía prioritaria de adquisición sobre </w:t>
@@ -8217,7 +8060,7 @@
     </w:p>
     <w:p>
       <w:pPr>
-        <w:pStyle w:val="Ttulo3"/>
+        <w:pStyle w:val="Heading3"/>
       </w:pPr>
       <w:r>
         <w:rPr>
@@ -8277,7 +8120,7 @@
     </w:p>
     <w:p>
       <w:pPr>
-        <w:pStyle w:val="Ttulo3"/>
+        <w:pStyle w:val="Heading3"/>
       </w:pPr>
       <w:r>
         <w:t>Los poderes conferidos a Finkargo Colombia en el presente Contrato son poderes amplios y suficientes para que el apoderado realice a su entera discreción todos los actos que considere necesarios para procurar el pago de las Obligaciones Garantizadas de conformidad con lo dispuesto en el presente Contrato.</w:t>
@@ -8285,7 +8128,7 @@
     </w:p>
     <w:p>
       <w:pPr>
-        <w:pStyle w:val="Ttulo3"/>
+        <w:pStyle w:val="Heading3"/>
       </w:pPr>
       <w:r>
         <w:t>El</w:t>
@@ -8302,7 +8145,7 @@
     </w:p>
     <w:p>
       <w:pPr>
-        <w:pStyle w:val="Ttulo3"/>
+        <w:pStyle w:val="Heading3"/>
       </w:pPr>
       <w:r>
         <w:t xml:space="preserve">Con </w:t>
@@ -8316,7 +8159,7 @@
     </w:p>
     <w:p>
       <w:pPr>
-        <w:pStyle w:val="Ttulo3"/>
+        <w:pStyle w:val="Heading3"/>
       </w:pPr>
       <w:r>
         <w:t xml:space="preserve">Este </w:t>
@@ -8330,7 +8173,7 @@
     </w:p>
     <w:p>
       <w:pPr>
-        <w:pStyle w:val="Ttulo2"/>
+        <w:pStyle w:val="Heading2"/>
         <w:tabs>
           <w:tab w:val="num" w:pos="1418"/>
         </w:tabs>
@@ -8436,7 +8279,7 @@
     </w:p>
     <w:p>
       <w:pPr>
-        <w:pStyle w:val="Ttulo1"/>
+        <w:pStyle w:val="Heading1"/>
         <w:jc w:val="center"/>
         <w:rPr>
           <w:lang w:val="es-CO"/>
@@ -8465,7 +8308,7 @@
     </w:p>
     <w:p>
       <w:pPr>
-        <w:pStyle w:val="Ttulo2"/>
+        <w:pStyle w:val="Heading2"/>
         <w:tabs>
           <w:tab w:val="num" w:pos="1418"/>
         </w:tabs>
@@ -8541,7 +8384,7 @@
     </w:p>
     <w:p>
       <w:pPr>
-        <w:pStyle w:val="Ttulo3"/>
+        <w:pStyle w:val="Heading3"/>
       </w:pPr>
       <w:r>
         <w:t xml:space="preserve">Realizar </w:t>
@@ -8635,7 +8478,7 @@
     </w:p>
     <w:p>
       <w:pPr>
-        <w:pStyle w:val="Ttulo3"/>
+        <w:pStyle w:val="Heading3"/>
       </w:pPr>
       <w:r>
         <w:t xml:space="preserve">Abstenerse </w:t>
@@ -8665,7 +8508,7 @@
     </w:p>
     <w:p>
       <w:pPr>
-        <w:pStyle w:val="Ttulo3"/>
+        <w:pStyle w:val="Heading3"/>
       </w:pPr>
       <w:r>
         <w:t xml:space="preserve">Mantener </w:t>
@@ -8685,7 +8528,7 @@
     </w:p>
     <w:p>
       <w:pPr>
-        <w:pStyle w:val="Ttulo3"/>
+        <w:pStyle w:val="Heading3"/>
       </w:pPr>
       <w:r>
         <w:t xml:space="preserve">Abstenerse </w:t>
@@ -8714,7 +8557,7 @@
     </w:p>
     <w:p>
       <w:pPr>
-        <w:pStyle w:val="Ttulo3"/>
+        <w:pStyle w:val="Heading3"/>
       </w:pPr>
       <w:r>
         <w:t xml:space="preserve">Notificar </w:t>
@@ -8740,7 +8583,7 @@
     </w:p>
     <w:p>
       <w:pPr>
-        <w:pStyle w:val="Ttulo3"/>
+        <w:pStyle w:val="Heading3"/>
       </w:pPr>
       <w:r>
         <w:t xml:space="preserve">Notificar </w:t>
@@ -8760,7 +8603,7 @@
     </w:p>
     <w:p>
       <w:pPr>
-        <w:pStyle w:val="Ttulo3"/>
+        <w:pStyle w:val="Heading3"/>
       </w:pPr>
       <w:r>
         <w:t xml:space="preserve">Entregar </w:t>
@@ -8810,7 +8653,7 @@
     </w:p>
     <w:p>
       <w:pPr>
-        <w:pStyle w:val="Ttulo3"/>
+        <w:pStyle w:val="Heading3"/>
       </w:pPr>
       <w:r>
         <w:t xml:space="preserve">Cumplir </w:t>
@@ -8824,7 +8667,7 @@
     </w:p>
     <w:p>
       <w:pPr>
-        <w:pStyle w:val="Ttulo3"/>
+        <w:pStyle w:val="Heading3"/>
       </w:pPr>
       <w:r>
         <w:t xml:space="preserve">Mantener </w:t>
@@ -8838,7 +8681,7 @@
     </w:p>
     <w:p>
       <w:pPr>
-        <w:pStyle w:val="Ttulo3"/>
+        <w:pStyle w:val="Heading3"/>
         <w:tabs>
           <w:tab w:val="num" w:pos="1418"/>
         </w:tabs>
@@ -8855,7 +8698,7 @@
     </w:p>
     <w:p>
       <w:pPr>
-        <w:pStyle w:val="Ttulo3"/>
+        <w:pStyle w:val="Heading3"/>
         <w:tabs>
           <w:tab w:val="num" w:pos="1418"/>
         </w:tabs>
@@ -8866,7 +8709,7 @@
     </w:p>
     <w:p>
       <w:pPr>
-        <w:pStyle w:val="Ttulo2"/>
+        <w:pStyle w:val="Heading2"/>
         <w:rPr>
           <w:vanish/>
           <w:specVanish/>
@@ -8898,7 +8741,7 @@
     </w:p>
     <w:p>
       <w:pPr>
-        <w:pStyle w:val="Ttulo1"/>
+        <w:pStyle w:val="Heading1"/>
         <w:jc w:val="center"/>
         <w:rPr>
           <w:lang w:val="es-CO"/>
@@ -8929,7 +8772,7 @@
     </w:p>
     <w:p>
       <w:pPr>
-        <w:pStyle w:val="Ttulo2"/>
+        <w:pStyle w:val="Heading2"/>
         <w:rPr>
           <w:vanish/>
           <w:lang w:val="es-CO"/>
@@ -8965,7 +8808,7 @@
     </w:p>
     <w:p>
       <w:pPr>
-        <w:pStyle w:val="Ttulo3"/>
+        <w:pStyle w:val="Heading3"/>
       </w:pPr>
       <w:r>
         <w:t>Una vez ocurra un Evento de Incumplimiento</w:t>
@@ -9030,7 +8873,7 @@
     </w:p>
     <w:p>
       <w:pPr>
-        <w:pStyle w:val="Ttulo3"/>
+        <w:pStyle w:val="Heading3"/>
       </w:pPr>
       <w:r>
         <w:t>Para el envío de una Notificación de Evento de Incumplimiento</w:t>
@@ -9068,7 +8911,7 @@
     </w:p>
     <w:p>
       <w:pPr>
-        <w:pStyle w:val="Ttulo2"/>
+        <w:pStyle w:val="Heading2"/>
         <w:rPr>
           <w:vanish/>
           <w:u w:val="none"/>
@@ -9107,7 +8950,7 @@
     </w:p>
     <w:p>
       <w:pPr>
-        <w:pStyle w:val="Ttulo3"/>
+        <w:pStyle w:val="Heading3"/>
       </w:pPr>
       <w:bookmarkStart w:id="63" w:name="_Ref143844860"/>
       <w:r>
@@ -9160,7 +9003,7 @@
     </w:p>
     <w:p>
       <w:pPr>
-        <w:pStyle w:val="Ttulo4"/>
+        <w:pStyle w:val="Heading4"/>
       </w:pPr>
       <w:bookmarkStart w:id="65" w:name="_Ref133475912"/>
       <w:r>
@@ -9197,11 +9040,9 @@
       <w:r>
         <w:t>) ejecución especial; (</w:t>
       </w:r>
-      <w:proofErr w:type="spellStart"/>
       <w:r>
         <w:t>iii</w:t>
       </w:r>
-      <w:proofErr w:type="spellEnd"/>
       <w:r>
         <w:t xml:space="preserve">) ejecución judicial. El ejercicio de cualquier derecho por parte de </w:t>
       </w:r>
@@ -9225,7 +9066,7 @@
     </w:p>
     <w:p>
       <w:pPr>
-        <w:pStyle w:val="Ttulo4"/>
+        <w:pStyle w:val="Heading4"/>
       </w:pPr>
       <w:r>
         <w:t xml:space="preserve">Si como resultado de la ejecución de la Garantía </w:t>
@@ -9234,37 +9075,21 @@
         <w:t>Finkargo Colombia</w:t>
       </w:r>
       <w:r>
-        <w:t xml:space="preserve"> recibe Pesos, las Obligaciones Garantizadas que estén denominadas en </w:t>
-      </w:r>
-      <w:proofErr w:type="gramStart"/>
-      <w:r>
-        <w:t>Dólares</w:t>
-      </w:r>
-      <w:proofErr w:type="gramEnd"/>
-      <w:r>
-        <w:t xml:space="preserve"> serán pagadas a la TRM vigente para la fecha en que se reciba el pago de la enajenación de los Bienes en Garantía de acuerdo con los procedimientos aquí previstos o de la fecha en que se realice la dación en pago o el pago en especie con los Bienes en Garantía.</w:t>
-      </w:r>
-    </w:p>
-    <w:p>
-      <w:pPr>
-        <w:pStyle w:val="Ttulo3"/>
+        <w:t xml:space="preserve"> recibe Pesos, las Obligaciones Garantizadas que estén denominadas en Dólares serán pagadas a la TRM vigente para la fecha en que se reciba el pago de la enajenación de los Bienes en Garantía de acuerdo con los procedimientos aquí previstos o de la fecha en que se realice la dación en pago o el pago en especie con los Bienes en Garantía.</w:t>
+      </w:r>
+    </w:p>
+    <w:p>
+      <w:pPr>
+        <w:pStyle w:val="Heading3"/>
       </w:pPr>
       <w:bookmarkStart w:id="66" w:name="_Hlk143859035"/>
       <w:r>
-        <w:t xml:space="preserve">Si como resultado de la ejecución de la Garantía Finkargo Colombia recibe Pesos, las Obligaciones Garantizadas que estén denominadas en </w:t>
-      </w:r>
-      <w:proofErr w:type="gramStart"/>
-      <w:r>
-        <w:t>Dólares</w:t>
-      </w:r>
-      <w:proofErr w:type="gramEnd"/>
-      <w:r>
-        <w:t xml:space="preserve"> serán pagadas a la TRM vigente para la fecha en que se reciba el pago de la enajenación de los Bienes en Garantía de acuerdo con los procedimientos aquí previstos o de la fecha en que se realice la dación en pago o el pago en especie con los Bienes en Garantía.</w:t>
-      </w:r>
-    </w:p>
-    <w:p>
-      <w:pPr>
-        <w:pStyle w:val="Ttulo3"/>
+        <w:t>Si como resultado de la ejecución de la Garantía Finkargo Colombia recibe Pesos, las Obligaciones Garantizadas que estén denominadas en Dólares serán pagadas a la TRM vigente para la fecha en que se reciba el pago de la enajenación de los Bienes en Garantía de acuerdo con los procedimientos aquí previstos o de la fecha en que se realice la dación en pago o el pago en especie con los Bienes en Garantía.</w:t>
+      </w:r>
+    </w:p>
+    <w:p>
+      <w:pPr>
+        <w:pStyle w:val="Heading3"/>
       </w:pPr>
       <w:r>
         <w:t xml:space="preserve">Sin perjuicio de lo establecido en la </w:t>
@@ -9314,7 +9139,7 @@
     </w:p>
     <w:p>
       <w:pPr>
-        <w:pStyle w:val="Ttulo2"/>
+        <w:pStyle w:val="Heading2"/>
         <w:rPr>
           <w:vanish/>
           <w:u w:val="none"/>
@@ -9354,7 +9179,7 @@
     </w:p>
     <w:p>
       <w:pPr>
-        <w:pStyle w:val="Ttulo3"/>
+        <w:pStyle w:val="Heading3"/>
       </w:pPr>
       <w:bookmarkStart w:id="69" w:name="_Ref129369107"/>
       <w:bookmarkStart w:id="70" w:name="_Ref136365253"/>
@@ -9412,7 +9237,7 @@
     </w:p>
     <w:p>
       <w:pPr>
-        <w:pStyle w:val="Ttulo3"/>
+        <w:pStyle w:val="Heading3"/>
       </w:pPr>
       <w:bookmarkStart w:id="71" w:name="_Ref129369435"/>
       <w:r>
@@ -9458,7 +9283,7 @@
     </w:p>
     <w:p>
       <w:pPr>
-        <w:pStyle w:val="Ttulo3"/>
+        <w:pStyle w:val="Heading3"/>
       </w:pPr>
       <w:r>
         <w:t>El Formulario de Ejecución se entenderá entregado al Importador con la notificación que el Registro de Garantías Mobiliarias realice al Importador, una vez inscrito el Formulario de Ejecución ante el Registro de Garantías Mobiliarias.</w:t>
@@ -9466,7 +9291,7 @@
     </w:p>
     <w:p>
       <w:pPr>
-        <w:pStyle w:val="Ttulo3"/>
+        <w:pStyle w:val="Heading3"/>
       </w:pPr>
       <w:r>
         <w:t>La(s) Parte(s) Garantizada(s)</w:t>
@@ -9514,15 +9339,7 @@
         <w:t xml:space="preserve"> o </w:t>
       </w:r>
       <w:r>
-        <w:t>(</w:t>
-      </w:r>
-      <w:proofErr w:type="spellStart"/>
-      <w:r>
-        <w:t>iii</w:t>
-      </w:r>
-      <w:proofErr w:type="spellEnd"/>
-      <w:r>
-        <w:t xml:space="preserve">) a través </w:t>
+        <w:t xml:space="preserve">(iii) a través </w:t>
       </w:r>
       <w:r>
         <w:t xml:space="preserve">del </w:t>
@@ -9542,7 +9359,7 @@
     </w:p>
     <w:p>
       <w:pPr>
-        <w:pStyle w:val="Ttulo3"/>
+        <w:pStyle w:val="Heading3"/>
       </w:pPr>
       <w:r>
         <w:t xml:space="preserve">Surtido el trámite anterior, </w:t>
@@ -9660,7 +9477,7 @@
     </w:p>
     <w:p>
       <w:pPr>
-        <w:pStyle w:val="Ttulo2"/>
+        <w:pStyle w:val="Heading2"/>
         <w:rPr>
           <w:vanish/>
           <w:u w:val="none"/>
@@ -9706,7 +9523,7 @@
     </w:p>
     <w:p>
       <w:pPr>
-        <w:pStyle w:val="Ttulo3"/>
+        <w:pStyle w:val="Heading3"/>
       </w:pPr>
       <w:r>
         <w:t>La(s) Parte(s) Garantizada(s)</w:t>
@@ -9833,7 +9650,7 @@
     </w:p>
     <w:p>
       <w:pPr>
-        <w:pStyle w:val="Ttulo3"/>
+        <w:pStyle w:val="Heading3"/>
       </w:pPr>
       <w:bookmarkStart w:id="75" w:name="_Ref132229379"/>
       <w:r>
@@ -9843,15 +9660,7 @@
         <w:t>Partes</w:t>
       </w:r>
       <w:r>
-        <w:t xml:space="preserve"> acuerdan que el avalúo de los Bienes en Garantía lo hará un </w:t>
-      </w:r>
-      <w:proofErr w:type="spellStart"/>
-      <w:r>
-        <w:t>Avaluador</w:t>
-      </w:r>
-      <w:proofErr w:type="spellEnd"/>
-      <w:r>
-        <w:t xml:space="preserve"> Independiente que cumpla con los Criterios de Independencia y Experiencia, seleccionado a discreción de </w:t>
+        <w:t xml:space="preserve"> acuerdan que el avalúo de los Bienes en Garantía lo hará un Avaluador Independiente que cumpla con los Criterios de Independencia y Experiencia, seleccionado a discreción de </w:t>
       </w:r>
       <w:r>
         <w:t>la(s) Parte(s) Garantizada(s)</w:t>
@@ -9967,7 +9776,7 @@
     </w:p>
     <w:p>
       <w:pPr>
-        <w:pStyle w:val="Ttulo3"/>
+        <w:pStyle w:val="Heading3"/>
       </w:pPr>
       <w:r>
         <w:t xml:space="preserve">De conformidad con lo dispuesto en el presente Contrato, en caso de que </w:t>
@@ -10077,7 +9886,7 @@
     </w:p>
     <w:p>
       <w:pPr>
-        <w:pStyle w:val="Ttulo2"/>
+        <w:pStyle w:val="Heading2"/>
         <w:rPr>
           <w:vanish/>
           <w:u w:val="none"/>
@@ -10290,7 +10099,7 @@
     </w:p>
     <w:p>
       <w:pPr>
-        <w:pStyle w:val="Ttulo3"/>
+        <w:pStyle w:val="Heading3"/>
         <w:numPr>
           <w:ilvl w:val="2"/>
           <w:numId w:val="32"/>
@@ -10398,7 +10207,7 @@
     </w:p>
     <w:p>
       <w:pPr>
-        <w:pStyle w:val="Ttulo3"/>
+        <w:pStyle w:val="Heading3"/>
       </w:pPr>
       <w:bookmarkStart w:id="78" w:name="_Ref129368778"/>
       <w:bookmarkStart w:id="79" w:name="_Ref136365338"/>
@@ -10418,15 +10227,7 @@
         <w:t>(n)</w:t>
       </w:r>
       <w:r>
-        <w:t xml:space="preserve"> los servicios de un </w:t>
-      </w:r>
-      <w:proofErr w:type="spellStart"/>
-      <w:r>
-        <w:t>Avaluador</w:t>
-      </w:r>
-      <w:proofErr w:type="spellEnd"/>
-      <w:r>
-        <w:t xml:space="preserve"> Independiente </w:t>
+        <w:t xml:space="preserve"> los servicios de un Avaluador Independiente </w:t>
       </w:r>
       <w:r>
         <w:t xml:space="preserve">de conformidad con lo establecido en la </w:t>
@@ -10550,7 +10351,7 @@
     </w:p>
     <w:p>
       <w:pPr>
-        <w:pStyle w:val="Ttulo4"/>
+        <w:pStyle w:val="Heading4"/>
       </w:pPr>
       <w:r>
         <w:t xml:space="preserve">Las </w:t>
@@ -10559,15 +10360,7 @@
         <w:t>Partes</w:t>
       </w:r>
       <w:r>
-        <w:t xml:space="preserve"> acuerdan que la selección del </w:t>
-      </w:r>
-      <w:proofErr w:type="spellStart"/>
-      <w:r>
-        <w:t>Avaluador</w:t>
-      </w:r>
-      <w:proofErr w:type="spellEnd"/>
-      <w:r>
-        <w:t xml:space="preserve"> Independiente y de la Valoración se realizará de conformidad con la </w:t>
+        <w:t xml:space="preserve"> acuerdan que la selección del Avaluador Independiente y de la Valoración se realizará de conformidad con la </w:t>
       </w:r>
       <w:r>
         <w:rPr>
@@ -10619,15 +10412,7 @@
         <w:fldChar w:fldCharType="end"/>
       </w:r>
       <w:r>
-        <w:t xml:space="preserve">, bajo el entendido que en caso de que ninguna entidad pueda ser contratada como </w:t>
-      </w:r>
-      <w:proofErr w:type="spellStart"/>
-      <w:r>
-        <w:t>Avaluador</w:t>
-      </w:r>
-      <w:proofErr w:type="spellEnd"/>
-      <w:r>
-        <w:t xml:space="preserve"> Independiente, </w:t>
+        <w:t xml:space="preserve">, bajo el entendido que en caso de que ninguna entidad pueda ser contratada como Avaluador Independiente, </w:t>
       </w:r>
       <w:r>
         <w:t>la(s) Parte(s) Garantizada(s)</w:t>
@@ -10647,7 +10432,7 @@
     </w:p>
     <w:p>
       <w:pPr>
-        <w:pStyle w:val="Ttulo4"/>
+        <w:pStyle w:val="Heading4"/>
         <w:rPr>
           <w:u w:val="single"/>
         </w:rPr>
@@ -10755,7 +10540,7 @@
     </w:p>
     <w:p>
       <w:pPr>
-        <w:pStyle w:val="Ttulo4"/>
+        <w:pStyle w:val="Heading4"/>
       </w:pPr>
       <w:r>
         <w:t xml:space="preserve">Una vez </w:t>
@@ -10784,7 +10569,7 @@
     </w:p>
     <w:p>
       <w:pPr>
-        <w:pStyle w:val="Ttulo4"/>
+        <w:pStyle w:val="Heading4"/>
         <w:numPr>
           <w:ilvl w:val="4"/>
           <w:numId w:val="1"/>
@@ -10812,7 +10597,7 @@
     </w:p>
     <w:p>
       <w:pPr>
-        <w:pStyle w:val="Ttulo4"/>
+        <w:pStyle w:val="Heading4"/>
         <w:numPr>
           <w:ilvl w:val="4"/>
           <w:numId w:val="1"/>
@@ -10908,21 +10693,13 @@
         <w:t>Poder Especial</w:t>
       </w:r>
       <w:r>
-        <w:t xml:space="preserve">”). El Poder Especial aquí otorgado es irrevocable y ha sido otorgado en beneficio </w:t>
-      </w:r>
-      <w:proofErr w:type="gramStart"/>
-      <w:r>
-        <w:t xml:space="preserve">de </w:t>
+        <w:t xml:space="preserve">”). El Poder Especial aquí otorgado es irrevocable y ha sido otorgado en beneficio de </w:t>
       </w:r>
       <w:r>
         <w:t xml:space="preserve"> </w:t>
       </w:r>
       <w:r>
-        <w:t>la</w:t>
-      </w:r>
-      <w:proofErr w:type="gramEnd"/>
-      <w:r>
-        <w:t>(s) Parte(s) Garantizada(s), según sea el caso</w:t>
+        <w:t>la(s) Parte(s) Garantizada(s), según sea el caso</w:t>
       </w:r>
       <w:r>
         <w:t xml:space="preserve">. Con la suscripción del presente Contrato </w:t>
@@ -10948,7 +10725,7 @@
     </w:p>
     <w:p>
       <w:pPr>
-        <w:pStyle w:val="Ttulo3"/>
+        <w:pStyle w:val="Heading3"/>
       </w:pPr>
       <w:r>
         <w:t xml:space="preserve">Las Partes aceptan que el precio de enajenación podrá ser inferior a la Valoración. En el evento en que no se reciban ofertas de compra satisfactorias para la(s) Parte(s) Garantizada(s), ésta(s) podrá(n) (y) llevar a cabo cualquiera de los procedimientos descritos en la </w:t>
@@ -10960,20 +10737,12 @@
         <w:t>Sección 7.01</w:t>
       </w:r>
       <w:r>
-        <w:t xml:space="preserve">; o (z) causar que un tercero reciba, los Bienes en Garantía en pago por un valor equivalente al 100% de la Valoración de </w:t>
-      </w:r>
-      <w:proofErr w:type="gramStart"/>
-      <w:r>
-        <w:t>los mismos</w:t>
-      </w:r>
-      <w:proofErr w:type="gramEnd"/>
-      <w:r>
-        <w:t>.</w:t>
-      </w:r>
-    </w:p>
-    <w:p>
-      <w:pPr>
-        <w:pStyle w:val="Ttulo3"/>
+        <w:t>; o (z) causar que un tercero reciba, los Bienes en Garantía en pago por un valor equivalente al 100% de la Valoración de los mismos.</w:t>
+      </w:r>
+    </w:p>
+    <w:p>
+      <w:pPr>
+        <w:pStyle w:val="Heading3"/>
       </w:pPr>
       <w:r>
         <w:t xml:space="preserve">El Importador renuncia expresamente a efectuar cualquier reclamación u objeción con respecto a las condiciones en las que se haya realizado la cesión o enajenación de los Bienes en Garantía, tales como precio, forma de pago, Cesionario y cualquier otra observación en relación con el contrato de cesión o el contrato de transferencia aplicable que se suscriba o los efectos o condiciones de la dación en pago que se realice, según sea el caso, siempre y cuando </w:t>
@@ -10997,7 +10766,7 @@
     </w:p>
     <w:p>
       <w:pPr>
-        <w:pStyle w:val="Ttulo3"/>
+        <w:pStyle w:val="Heading3"/>
       </w:pPr>
       <w:r>
         <w:t xml:space="preserve">En cualquier momento anterior a que </w:t>
@@ -11023,7 +10792,7 @@
     </w:p>
     <w:p>
       <w:pPr>
-        <w:pStyle w:val="Ttulo3"/>
+        <w:pStyle w:val="Heading3"/>
       </w:pPr>
       <w:r>
         <w:t>La(s) Parte(s) Garantizada(s)</w:t>
@@ -11058,7 +10827,7 @@
     </w:p>
     <w:p>
       <w:pPr>
-        <w:pStyle w:val="Ttulo3"/>
+        <w:pStyle w:val="Heading3"/>
       </w:pPr>
       <w:r>
         <w:t>La Garantía no será</w:t>
@@ -11078,7 +10847,7 @@
     </w:p>
     <w:p>
       <w:pPr>
-        <w:pStyle w:val="Ttulo2"/>
+        <w:pStyle w:val="Heading2"/>
         <w:rPr>
           <w:vanish/>
           <w:specVanish/>
@@ -11206,15 +10975,7 @@
         <w:t>Finkargo Colombia</w:t>
       </w:r>
       <w:r>
-        <w:t xml:space="preserve"> contratará los servicios de un </w:t>
-      </w:r>
-      <w:proofErr w:type="spellStart"/>
-      <w:r>
-        <w:t>Avaluador</w:t>
-      </w:r>
-      <w:proofErr w:type="spellEnd"/>
-      <w:r>
-        <w:t xml:space="preserve"> Independiente que cumpla con los Criterios de Independencia y Experiencia y cualesquiera otros criterios que le sean exigibles </w:t>
+        <w:t xml:space="preserve"> contratará los servicios de un Avaluador Independiente que cumpla con los Criterios de Independencia y Experiencia y cualesquiera otros criterios que le sean exigibles </w:t>
       </w:r>
       <w:r>
         <w:lastRenderedPageBreak/>
@@ -11223,7 +10984,7 @@
     </w:p>
     <w:p>
       <w:pPr>
-        <w:pStyle w:val="Ttulo3"/>
+        <w:pStyle w:val="Heading3"/>
       </w:pPr>
       <w:bookmarkStart w:id="88" w:name="_Ref129868122"/>
       <w:r>
@@ -11251,15 +11012,7 @@
         <w:t>(n)</w:t>
       </w:r>
       <w:r>
-        <w:t xml:space="preserve"> los servicios de un </w:t>
-      </w:r>
-      <w:proofErr w:type="spellStart"/>
-      <w:r>
-        <w:t>Avaluador</w:t>
-      </w:r>
-      <w:proofErr w:type="spellEnd"/>
-      <w:r>
-        <w:t xml:space="preserve"> Independiente en los términos establecidos en esta </w:t>
+        <w:t xml:space="preserve"> los servicios de un Avaluador Independiente en los términos establecidos en esta </w:t>
       </w:r>
       <w:r>
         <w:rPr>
@@ -11303,15 +11056,7 @@
         <w:t xml:space="preserve"> </w:t>
       </w:r>
       <w:r>
-        <w:t xml:space="preserve">En el evento en que la contratación del </w:t>
-      </w:r>
-      <w:proofErr w:type="spellStart"/>
-      <w:r>
-        <w:t>Avaluador</w:t>
-      </w:r>
-      <w:proofErr w:type="spellEnd"/>
-      <w:r>
-        <w:t xml:space="preserve"> Independiente no pueda realizarse en el plazo señalado, dicho plazo será extendido por el tiempo que, a juicio de </w:t>
+        <w:t xml:space="preserve">En el evento en que la contratación del Avaluador Independiente no pueda realizarse en el plazo señalado, dicho plazo será extendido por el tiempo que, a juicio de </w:t>
       </w:r>
       <w:r>
         <w:t>la(s) Parte(s) Garantizada(s)</w:t>
@@ -11323,19 +11068,11 @@
     </w:p>
     <w:p>
       <w:pPr>
-        <w:pStyle w:val="Ttulo3"/>
+        <w:pStyle w:val="Heading3"/>
       </w:pPr>
       <w:bookmarkStart w:id="89" w:name="_Ref129868124"/>
       <w:r>
-        <w:t xml:space="preserve">En caso de que ninguna entidad pueda ser contratada como </w:t>
-      </w:r>
-      <w:proofErr w:type="spellStart"/>
-      <w:r>
-        <w:t>Avaluador</w:t>
-      </w:r>
-      <w:proofErr w:type="spellEnd"/>
-      <w:r>
-        <w:t xml:space="preserve"> Independiente, </w:t>
+        <w:t xml:space="preserve">En caso de que ninguna entidad pueda ser contratada como Avaluador Independiente, </w:t>
       </w:r>
       <w:r>
         <w:t>la(s) Parte(s) Garantizada(s)</w:t>
@@ -11353,19 +11090,11 @@
     </w:p>
     <w:p>
       <w:pPr>
-        <w:pStyle w:val="Ttulo3"/>
+        <w:pStyle w:val="Heading3"/>
       </w:pPr>
       <w:bookmarkStart w:id="90" w:name="_Ref129868074"/>
       <w:r>
-        <w:t xml:space="preserve">Una vez seleccionado el </w:t>
-      </w:r>
-      <w:proofErr w:type="spellStart"/>
-      <w:r>
-        <w:t>Avaluador</w:t>
-      </w:r>
-      <w:proofErr w:type="spellEnd"/>
-      <w:r>
-        <w:t xml:space="preserve"> Independiente, este deberá iniciar de forma inmediata las labores y actividades tendientes a determinar el avalúo de los Bienes en Garantía (la “</w:t>
+        <w:t>Una vez seleccionado el Avaluador Independiente, este deberá iniciar de forma inmediata las labores y actividades tendientes a determinar el avalúo de los Bienes en Garantía (la “</w:t>
       </w:r>
       <w:r>
         <w:rPr>
@@ -11380,7 +11109,7 @@
     </w:p>
     <w:p>
       <w:pPr>
-        <w:pStyle w:val="Ttulo3"/>
+        <w:pStyle w:val="Heading3"/>
       </w:pPr>
       <w:bookmarkStart w:id="91" w:name="_Ref129868077"/>
       <w:r>
@@ -11402,7 +11131,7 @@
     </w:p>
     <w:p>
       <w:pPr>
-        <w:pStyle w:val="Ttulo2"/>
+        <w:pStyle w:val="Heading2"/>
         <w:rPr>
           <w:vanish/>
           <w:u w:val="none"/>
@@ -11434,7 +11163,7 @@
     </w:p>
     <w:p>
       <w:pPr>
-        <w:pStyle w:val="Ttulo3"/>
+        <w:pStyle w:val="Heading3"/>
       </w:pPr>
       <w:r>
         <w:t xml:space="preserve">Cualquier costo asociado a, o derivado de la ejecución de </w:t>
@@ -11475,7 +11204,7 @@
     </w:p>
     <w:p>
       <w:pPr>
-        <w:pStyle w:val="Ttulo3"/>
+        <w:pStyle w:val="Heading3"/>
       </w:pPr>
       <w:r>
         <w:t xml:space="preserve">Cualquier recurso derivado del proceso de ejecución </w:t>
@@ -11539,7 +11268,7 @@
     </w:p>
     <w:p>
       <w:pPr>
-        <w:pStyle w:val="Ttulo3"/>
+        <w:pStyle w:val="Heading3"/>
       </w:pPr>
       <w:r>
         <w:t xml:space="preserve">No obstante, en concordancia con el numeral 3 del artículo 70 de la Ley de Garantías Mobiliarias, el remanente, si lo hubiere, se entregará, previas las deducciones del caso, al Importador, según corresponda, dentro de los </w:t>
@@ -11562,7 +11291,7 @@
     </w:p>
     <w:p>
       <w:pPr>
-        <w:pStyle w:val="Ttulo2"/>
+        <w:pStyle w:val="Heading2"/>
         <w:rPr>
           <w:vanish/>
           <w:u w:val="none"/>
@@ -11598,7 +11327,7 @@
     </w:p>
     <w:p>
       <w:pPr>
-        <w:pStyle w:val="Ttulo3"/>
+        <w:pStyle w:val="Heading3"/>
       </w:pPr>
       <w:r>
         <w:t xml:space="preserve">Todos y cada uno de los derechos, poderes, facultades y recursos específicamente otorgados a </w:t>
@@ -11648,7 +11377,7 @@
     </w:p>
     <w:p>
       <w:pPr>
-        <w:pStyle w:val="Ttulo3"/>
+        <w:pStyle w:val="Heading3"/>
       </w:pPr>
       <w:r>
         <w:t xml:space="preserve">Todos estos derechos, poderes, facultades y recursos serán acumulables y el ejercicio o el inicio del ejercicio de uno no implicarán la renuncia de ninguno otro de dichos derechos. </w:t>
@@ -11672,7 +11401,7 @@
     </w:p>
     <w:p>
       <w:pPr>
-        <w:pStyle w:val="Ttulo3"/>
+        <w:pStyle w:val="Heading3"/>
       </w:pPr>
       <w:r>
         <w:t>La falta de la Notificación de Evento de Incumplimiento</w:t>
@@ -11692,7 +11421,7 @@
     </w:p>
     <w:p>
       <w:pPr>
-        <w:pStyle w:val="Ttulo3"/>
+        <w:pStyle w:val="Heading3"/>
       </w:pPr>
       <w:r>
         <w:t xml:space="preserve">En el evento en que </w:t>
@@ -11724,7 +11453,7 @@
     </w:p>
     <w:p>
       <w:pPr>
-        <w:pStyle w:val="Ttulo1"/>
+        <w:pStyle w:val="Heading1"/>
         <w:jc w:val="center"/>
         <w:rPr>
           <w:lang w:val="es-CO"/>
@@ -11748,7 +11477,7 @@
     </w:p>
     <w:p>
       <w:pPr>
-        <w:pStyle w:val="Ttulo2"/>
+        <w:pStyle w:val="Heading2"/>
         <w:numPr>
           <w:ilvl w:val="1"/>
           <w:numId w:val="6"/>
@@ -11784,7 +11513,7 @@
     </w:p>
     <w:p>
       <w:pPr>
-        <w:pStyle w:val="Ttulo3"/>
+        <w:pStyle w:val="Heading3"/>
       </w:pPr>
       <w:r>
         <w:t>Las Partes sus administradores, empleados y agentes</w:t>
@@ -11805,7 +11534,7 @@
     </w:p>
     <w:p>
       <w:pPr>
-        <w:pStyle w:val="Ttulo3"/>
+        <w:pStyle w:val="Heading3"/>
       </w:pPr>
       <w:r>
         <w:t xml:space="preserve">Si una Autoridad Gubernamental obliga a cualquiera de las Partes a revelar Información Confidencial, no será un incumplimiento del Contrato la divulgación en la medida requerida por dicha orden, siempre y cuando la Parte que reciba la orden notifique a la otra Parte al menos </w:t>
@@ -11835,7 +11564,7 @@
     </w:p>
     <w:p>
       <w:pPr>
-        <w:pStyle w:val="Ttulo3"/>
+        <w:pStyle w:val="Heading3"/>
       </w:pPr>
       <w:r>
         <w:t xml:space="preserve">Las Partes reconocen que el derecho, título e interés en la Información Confidencial con respecto a la otra Parte como tal deben ser y permanecer la propiedad exclusiva de la otra Parte. A menos que se disponga lo contrario por escrito, toda la información tangible con respecto a cualquiera de las Partes deberá ser devuelta de inmediato por la otra Parte previa solicitud o ser destruida por la Parte a solicitud previa </w:t>
@@ -11849,7 +11578,7 @@
     </w:p>
     <w:p>
       <w:pPr>
-        <w:pStyle w:val="Ttulo3"/>
+        <w:pStyle w:val="Heading3"/>
       </w:pPr>
       <w:r>
         <w:t>Las Partes utilizarán el mismo grado de cuidado para evitar la divulgación de la Información Confidencial de la otra Parte que emplean con respecto a su propia información confidencial, pero en ningún caso debe ser inferior a un cuidado razonable.</w:t>
@@ -11857,7 +11586,7 @@
     </w:p>
     <w:p>
       <w:pPr>
-        <w:pStyle w:val="Ttulo3"/>
+        <w:pStyle w:val="Heading3"/>
       </w:pPr>
       <w:r>
         <w:t>Las restricciones contenidas en esta cláusula seguirán aplicándose durante un período de tres (3) años tras la terminación o expiración del presente Contrato, lo que ocurra primero. Las disposiciones de esta cláusula prevalecerán sobre cualquier acuerdo de confidencialidad previo entre las Partes en relación con el objeto del presente Contrato.</w:t>
@@ -11865,7 +11594,7 @@
     </w:p>
     <w:p>
       <w:pPr>
-        <w:pStyle w:val="Ttulo2"/>
+        <w:pStyle w:val="Heading2"/>
         <w:rPr>
           <w:vanish/>
           <w:lang w:val="es-CO"/>
@@ -11898,7 +11627,7 @@
     </w:p>
     <w:p>
       <w:pPr>
-        <w:pStyle w:val="Ttulo3"/>
+        <w:pStyle w:val="Heading3"/>
       </w:pPr>
       <w:r>
         <w:t>Cuando la Parte receptora tenga evidencia de que conoce previamente la información recibida sin ningún tipo de obligación de confidencialidad.</w:t>
@@ -11908,7 +11637,7 @@
     </w:p>
     <w:p>
       <w:pPr>
-        <w:pStyle w:val="Ttulo3"/>
+        <w:pStyle w:val="Heading3"/>
       </w:pPr>
       <w:r>
         <w:t>Cuando en o luego de su divulgación a la Parte receptora, la Información Confidencial devino en información de conocimiento o dominio público, siempre y cuando tal situación no se haya derivado de un incumplimiento bajo este Contrato.</w:t>
@@ -11918,7 +11647,7 @@
     </w:p>
     <w:p>
       <w:pPr>
-        <w:pStyle w:val="Ttulo3"/>
+        <w:pStyle w:val="Heading3"/>
       </w:pPr>
       <w:r>
         <w:t>Cuando la información deje de ser confidencial por ser revelada al público por el propietario.</w:t>
@@ -11928,7 +11657,7 @@
     </w:p>
     <w:p>
       <w:pPr>
-        <w:pStyle w:val="Ttulo3"/>
+        <w:pStyle w:val="Heading3"/>
       </w:pPr>
       <w:r>
         <w:t>Cuando la información haya sido independientemente desarrollada por parte de la Parte receptora, sin referencia alguna o uso de la Información Confidencial.</w:t>
@@ -11938,7 +11667,7 @@
     </w:p>
     <w:p>
       <w:pPr>
-        <w:pStyle w:val="Ttulo3"/>
+        <w:pStyle w:val="Heading3"/>
       </w:pPr>
       <w:r>
         <w:t>Cuando la Parte receptora haya recibido aprobación escrita por parte de la otra Parte, respecto a la divulgación de la Información Confidencial</w:t>
@@ -11951,7 +11680,7 @@
     </w:p>
     <w:p>
       <w:pPr>
-        <w:pStyle w:val="Ttulo3"/>
+        <w:pStyle w:val="Heading3"/>
       </w:pPr>
       <w:r>
         <w:t>Cuando la Parte receptora o sus representantes sean requeridos a revelar la Información Confidencial bajo cualquier Ley Aplicable, una Autoridad Gubernamental, judicial, administrativa o regulatoria competente (incluyendo cualquier agencia gubernamental o cualquier bolsa de valores reconocida).</w:t>
@@ -11960,7 +11689,7 @@
     </w:p>
     <w:p>
       <w:pPr>
-        <w:pStyle w:val="Ttulo2"/>
+        <w:pStyle w:val="Heading2"/>
         <w:rPr>
           <w:vanish/>
           <w:specVanish/>
@@ -11993,7 +11722,7 @@
     </w:p>
     <w:p>
       <w:pPr>
-        <w:pStyle w:val="Ttulo3"/>
+        <w:pStyle w:val="Heading3"/>
       </w:pPr>
       <w:r>
         <w:t>Finkargo Colombia</w:t>
@@ -12004,7 +11733,7 @@
     </w:p>
     <w:p>
       <w:pPr>
-        <w:pStyle w:val="Ttulo3"/>
+        <w:pStyle w:val="Heading3"/>
       </w:pPr>
       <w:r>
         <w:t xml:space="preserve">El Importador autoriza de manera libre, voluntaria, previa, expresa, a </w:t>
@@ -12013,31 +11742,7 @@
         <w:t>Finkargo Colombia</w:t>
       </w:r>
       <w:r>
-        <w:t xml:space="preserve"> y sus Afiliadas, así como a </w:t>
-      </w:r>
-      <w:proofErr w:type="spellStart"/>
-      <w:r>
-        <w:t>Community</w:t>
-      </w:r>
-      <w:proofErr w:type="spellEnd"/>
-      <w:r>
-        <w:t xml:space="preserve"> EM </w:t>
-      </w:r>
-      <w:proofErr w:type="spellStart"/>
-      <w:r>
-        <w:t>Credit</w:t>
-      </w:r>
-      <w:proofErr w:type="spellEnd"/>
-      <w:r>
-        <w:t xml:space="preserve"> </w:t>
-      </w:r>
-      <w:proofErr w:type="spellStart"/>
-      <w:r>
-        <w:t>Fund</w:t>
-      </w:r>
-      <w:proofErr w:type="spellEnd"/>
-      <w:r>
-        <w:t xml:space="preserve"> SCA., SICAV-RAIF, Fiduciaria Scotiabank Colpatria S.A., Manejo Técnico de Información S.A. (y/o a quien, de tiempo en tiempo, durante la Vigencia, lleve a cabo las funciones de éste para con </w:t>
+        <w:t xml:space="preserve"> y sus Afiliadas, así como a Community EM Credit Fund SCA., SICAV-RAIF, Fiduciaria Scotiabank Colpatria S.A., Manejo Técnico de Información S.A. (y/o a quien, de tiempo en tiempo, durante la Vigencia, lleve a cabo las funciones de éste para con </w:t>
       </w:r>
       <w:r>
         <w:t>Finkargo Colombia</w:t>
@@ -12054,7 +11759,7 @@
     </w:p>
     <w:p>
       <w:pPr>
-        <w:pStyle w:val="Ttulo3"/>
+        <w:pStyle w:val="Heading3"/>
       </w:pPr>
       <w:r>
         <w:t xml:space="preserve">El Importador autoriza a </w:t>
@@ -12063,15 +11768,7 @@
         <w:t>Finkargo Colombia</w:t>
       </w:r>
       <w:r>
-        <w:t xml:space="preserve"> para que trate, transfiera o transmita los Datos Personales a terceros, como patrimonios autónomos, y/o beneficiarios de </w:t>
-      </w:r>
-      <w:proofErr w:type="gramStart"/>
-      <w:r>
-        <w:t>los mismos</w:t>
-      </w:r>
-      <w:proofErr w:type="gramEnd"/>
-      <w:r>
-        <w:t xml:space="preserve">, incluyendo al Beneficiario, incluso a países que no cuenten con los niveles adecuados de protección, con las finalidades establecidas en la Política de </w:t>
+        <w:t xml:space="preserve"> para que trate, transfiera o transmita los Datos Personales a terceros, como patrimonios autónomos, y/o beneficiarios de los mismos, incluyendo al Beneficiario, incluso a países que no cuenten con los niveles adecuados de protección, con las finalidades establecidas en la Política de </w:t>
       </w:r>
       <w:r>
         <w:t>Privacidad</w:t>
@@ -12082,7 +11779,7 @@
       <w:hyperlink r:id="rId11" w:history="1">
         <w:r>
           <w:rPr>
-            <w:rStyle w:val="Hipervnculo"/>
+            <w:rStyle w:val="Hyperlink"/>
           </w:rPr>
           <w:t>www.finkargo.com</w:t>
         </w:r>
@@ -12106,7 +11803,7 @@
     </w:p>
     <w:p>
       <w:pPr>
-        <w:pStyle w:val="Ttulo3"/>
+        <w:pStyle w:val="Heading3"/>
         <w:rPr>
           <w:b/>
           <w:u w:val="single"/>
@@ -12148,7 +11845,7 @@
       <w:hyperlink r:id="rId12" w:history="1">
         <w:r>
           <w:rPr>
-            <w:rStyle w:val="Hipervnculo"/>
+            <w:rStyle w:val="Hyperlink"/>
           </w:rPr>
           <w:t>notificaciones@finkargo.com</w:t>
         </w:r>
@@ -12177,7 +11874,7 @@
       <w:hyperlink r:id="rId13" w:history="1">
         <w:r>
           <w:rPr>
-            <w:rStyle w:val="Hipervnculo"/>
+            <w:rStyle w:val="Hyperlink"/>
           </w:rPr>
           <w:t>www.finkargo.com</w:t>
         </w:r>
@@ -12188,7 +11885,7 @@
     </w:p>
     <w:p>
       <w:pPr>
-        <w:pStyle w:val="Ttulo1"/>
+        <w:pStyle w:val="Heading1"/>
         <w:jc w:val="center"/>
         <w:rPr>
           <w:lang w:val="es-CO"/>
@@ -12210,7 +11907,7 @@
     </w:p>
     <w:p>
       <w:pPr>
-        <w:pStyle w:val="Ttulo2"/>
+        <w:pStyle w:val="Heading2"/>
         <w:rPr>
           <w:vanish/>
           <w:lang w:val="es-CO"/>
@@ -12297,7 +11994,7 @@
     </w:p>
     <w:p>
       <w:pPr>
-        <w:pStyle w:val="Ttulo2"/>
+        <w:pStyle w:val="Heading2"/>
         <w:rPr>
           <w:vanish/>
           <w:lang w:val="es-CO"/>
@@ -12524,7 +12221,7 @@
     </w:p>
     <w:tbl>
       <w:tblPr>
-        <w:tblStyle w:val="Tablaconcuadrcula"/>
+        <w:tblStyle w:val="TableGrid"/>
         <w:tblW w:w="9978" w:type="dxa"/>
         <w:tblBorders>
           <w:top w:val="none" w:sz="0" w:space="0" w:color="auto"/>
@@ -12603,6 +12300,12 @@
             </w:r>
             <w:r>
               <w:rPr>
+                <w:lang w:val="it-IT"/>
+              </w:rPr>
+              <w:t xml:space="preserve"> KAM </w:t>
+            </w:r>
+            <w:r>
+              <w:rPr>
                 <w:highlight w:val="yellow"/>
                 <w:lang w:val="it-IT"/>
               </w:rPr>
@@ -12635,48 +12338,25 @@
               <w:br/>
               <w:t xml:space="preserve">E-mail: </w:t>
             </w:r>
-            <w:r>
-              <w:rPr>
-                <w:lang w:val="es-MX"/>
-              </w:rPr>
-              <w:fldChar w:fldCharType="begin"/>
-            </w:r>
-            <w:r>
-              <w:rPr>
-                <w:lang w:val="pt-PT"/>
-              </w:rPr>
-              <w:instrText>HYPERLINK "mailto:andres.gonzalez@finkargo.com"</w:instrText>
-            </w:r>
-            <w:r>
-              <w:rPr>
-                <w:lang w:val="es-MX"/>
-              </w:rPr>
-              <w:fldChar w:fldCharType="separate"/>
-            </w:r>
-            <w:r>
-              <w:rPr>
-                <w:rStyle w:val="Hipervnculo"/>
-                <w:lang w:val="pt-PT"/>
-              </w:rPr>
-              <w:t>andres.gonzalez@finkargo.com</w:t>
-            </w:r>
-            <w:r>
-              <w:rPr>
-                <w:rStyle w:val="Hipervnculo"/>
-                <w:lang w:val="pt-PT"/>
-              </w:rPr>
-              <w:fldChar w:fldCharType="end"/>
-            </w:r>
-            <w:r>
-              <w:rPr>
-                <w:lang w:val="pt-PT"/>
-              </w:rPr>
-              <w:br/>
-            </w:r>
             <w:hyperlink r:id="rId14" w:history="1">
               <w:r>
                 <w:rPr>
-                  <w:rStyle w:val="Hipervnculo"/>
+                  <w:rStyle w:val="Hyperlink"/>
+                  <w:lang w:val="pt-PT"/>
+                </w:rPr>
+                <w:t>andres.gonzalez@finkargo.com</w:t>
+              </w:r>
+            </w:hyperlink>
+            <w:r>
+              <w:rPr>
+                <w:lang w:val="pt-PT"/>
+              </w:rPr>
+              <w:br/>
+            </w:r>
+            <w:hyperlink r:id="rId15" w:history="1">
+              <w:r>
+                <w:rPr>
+                  <w:rStyle w:val="Hyperlink"/>
                   <w:lang w:val="pt-PT"/>
                 </w:rPr>
                 <w:t>jeniffer.medina@finkargo.com</w:t>
@@ -12688,10 +12368,10 @@
               </w:rPr>
               <w:br/>
             </w:r>
-            <w:hyperlink r:id="rId15" w:history="1">
+            <w:hyperlink r:id="rId16" w:history="1">
               <w:r>
                 <w:rPr>
-                  <w:rStyle w:val="Hipervnculo"/>
+                  <w:rStyle w:val="Hyperlink"/>
                   <w:lang w:val="pt-PT"/>
                 </w:rPr>
                 <w:t>maria.garrido@finkargo.com</w:t>
@@ -12756,6 +12436,20 @@
                 <w:highlight w:val="yellow"/>
                 <w:lang w:val="it-IT"/>
               </w:rPr>
+              <w:t>destinatario</w:t>
+            </w:r>
+            <w:r>
+              <w:rPr>
+                <w:highlight w:val="yellow"/>
+                <w:lang w:val="it-IT"/>
+              </w:rPr>
+              <w:t xml:space="preserve"> </w:t>
+            </w:r>
+            <w:r>
+              <w:rPr>
+                <w:highlight w:val="yellow"/>
+                <w:lang w:val="it-IT"/>
+              </w:rPr>
               <w:t>e-mail</w:t>
             </w:r>
             <w:r>
@@ -12770,7 +12464,7 @@
     </w:tbl>
     <w:p>
       <w:pPr>
-        <w:pStyle w:val="Ttulo2"/>
+        <w:pStyle w:val="Heading2"/>
         <w:rPr>
           <w:lang w:val="es-CO"/>
         </w:rPr>
@@ -12804,18 +12498,13 @@
     </w:p>
     <w:p>
       <w:pPr>
-        <w:pStyle w:val="Ttulo3"/>
+        <w:pStyle w:val="Heading3"/>
       </w:pPr>
       <w:r>
         <w:t xml:space="preserve">Todas las modificaciones, adiciones, aclaraciones y/o renuncias que se efectúen al presente Contrato, serán válidas cuando consten por escrito y estén debidamente firmadas por los </w:t>
       </w:r>
-      <w:proofErr w:type="gramStart"/>
-      <w:r>
-        <w:t>Funcionarios</w:t>
-      </w:r>
-      <w:proofErr w:type="gramEnd"/>
-      <w:r>
-        <w:t xml:space="preserve"> Autorizados </w:t>
+      <w:r>
+        <w:t xml:space="preserve">Funcionarios Autorizados </w:t>
       </w:r>
       <w:r>
         <w:t xml:space="preserve">de cada una de las Partes. Las Partes convienen en que, el dejar de ejercer, </w:t>
@@ -12827,7 +12516,7 @@
     </w:p>
     <w:p>
       <w:pPr>
-        <w:pStyle w:val="Ttulo3"/>
+        <w:pStyle w:val="Heading3"/>
       </w:pPr>
       <w:r>
         <w:t xml:space="preserve">Sin perjuicio de lo previsto anteriormente, las modificaciones que deban realizarse al </w:t>
@@ -12859,7 +12548,7 @@
     </w:p>
     <w:p>
       <w:pPr>
-        <w:pStyle w:val="Ttulo2"/>
+        <w:pStyle w:val="Heading2"/>
         <w:rPr>
           <w:vanish/>
           <w:lang w:val="es-CO"/>
@@ -12932,7 +12621,7 @@
     </w:p>
     <w:p>
       <w:pPr>
-        <w:pStyle w:val="Ttulo2"/>
+        <w:pStyle w:val="Heading2"/>
         <w:rPr>
           <w:vanish/>
           <w:lang w:val="es-CO"/>
@@ -12976,7 +12665,7 @@
     </w:p>
     <w:p>
       <w:pPr>
-        <w:pStyle w:val="Ttulo3"/>
+        <w:pStyle w:val="Heading3"/>
       </w:pPr>
       <w:bookmarkStart w:id="113" w:name="_Hlk132230909"/>
       <w:bookmarkEnd w:id="112"/>
@@ -13037,7 +12726,7 @@
     </w:p>
     <w:p>
       <w:pPr>
-        <w:pStyle w:val="Ttulo3"/>
+        <w:pStyle w:val="Heading3"/>
       </w:pPr>
       <w:r>
         <w:t xml:space="preserve">El Importador no podrá ceder, transferir, enajenar, aportar </w:t>
@@ -13060,7 +12749,7 @@
     </w:p>
     <w:p>
       <w:pPr>
-        <w:pStyle w:val="Ttulo2"/>
+        <w:pStyle w:val="Heading2"/>
         <w:rPr>
           <w:vanish/>
           <w:lang w:val="es-CO"/>
@@ -13097,7 +12786,7 @@
     </w:p>
     <w:p>
       <w:pPr>
-        <w:pStyle w:val="Lista"/>
+        <w:pStyle w:val="List"/>
         <w:rPr>
           <w:lang w:val="es-CO"/>
         </w:rPr>
@@ -13119,7 +12808,7 @@
     </w:p>
     <w:p>
       <w:pPr>
-        <w:pStyle w:val="Ttulo2"/>
+        <w:pStyle w:val="Heading2"/>
         <w:rPr>
           <w:vanish/>
           <w:lang w:val="es-CO"/>
@@ -13162,7 +12851,7 @@
     </w:p>
     <w:p>
       <w:pPr>
-        <w:pStyle w:val="Ttulo2"/>
+        <w:pStyle w:val="Heading2"/>
         <w:rPr>
           <w:vanish/>
           <w:lang w:val="es-CO"/>
@@ -13219,7 +12908,7 @@
     </w:p>
     <w:p>
       <w:pPr>
-        <w:pStyle w:val="Ttulo2"/>
+        <w:pStyle w:val="Heading2"/>
         <w:rPr>
           <w:vanish/>
           <w:specVanish/>
@@ -13242,20 +12931,12 @@
         </w:rPr>
       </w:pPr>
       <w:r>
-        <w:t xml:space="preserve">. Forman parte integral del presente Contrato todos sus Anexos, incluyendo los que se incorporen con posterioridad a la firma </w:t>
-      </w:r>
-      <w:proofErr w:type="gramStart"/>
-      <w:r>
-        <w:t>del mismo</w:t>
-      </w:r>
-      <w:proofErr w:type="gramEnd"/>
-      <w:r>
-        <w:t>.</w:t>
-      </w:r>
-    </w:p>
-    <w:p>
-      <w:pPr>
-        <w:pStyle w:val="Ttulo2"/>
+        <w:t>. Forman parte integral del presente Contrato todos sus Anexos, incluyendo los que se incorporen con posterioridad a la firma del mismo.</w:t>
+      </w:r>
+    </w:p>
+    <w:p>
+      <w:pPr>
+        <w:pStyle w:val="Heading2"/>
         <w:rPr>
           <w:vanish/>
           <w:lang w:val="es-CO"/>
@@ -13302,15 +12983,7 @@
         <w:t xml:space="preserve"> de </w:t>
       </w:r>
       <w:r>
-        <w:t xml:space="preserve">firmas electrónicas </w:t>
-      </w:r>
-      <w:proofErr w:type="spellStart"/>
-      <w:r>
-        <w:t>DocuSign</w:t>
-      </w:r>
-      <w:proofErr w:type="spellEnd"/>
-      <w:r>
-        <w:t>, de conformidad con la Ley 527 de 1999 y el Decreto 2364 de 2012. Estas firmas surtirán los mismos efectos jurídicos como si constara por firma autógrafa. Las Partes otorgan su pleno consentimiento para obligarse legalmente conforme a los términos del presente Contrato</w:t>
+        <w:t>firmas electrónicas DocuSign, de conformidad con la Ley 527 de 1999 y el Decreto 2364 de 2012. Estas firmas surtirán los mismos efectos jurídicos como si constara por firma autógrafa. Las Partes otorgan su pleno consentimiento para obligarse legalmente conforme a los términos del presente Contrato</w:t>
       </w:r>
       <w:r>
         <w:t>.</w:t>
@@ -13411,13 +13084,8 @@
             </w:r>
             <w:r>
               <w:br/>
-              <w:t xml:space="preserve">John Elvis Jiménez </w:t>
-            </w:r>
-            <w:proofErr w:type="spellStart"/>
-            <w:r>
-              <w:t>Jiménez</w:t>
-            </w:r>
-            <w:proofErr w:type="spellEnd"/>
+              <w:t>John Elvis Jiménez Jiménez</w:t>
+            </w:r>
             <w:r>
               <w:br/>
               <w:t>C.C.</w:t>
@@ -13492,7 +13160,19 @@
               <w:rPr>
                 <w:highlight w:val="yellow"/>
               </w:rPr>
-              <w:t>[•]</w:t>
+              <w:t>[</w:t>
+            </w:r>
+            <w:r>
+              <w:rPr>
+                <w:highlight w:val="yellow"/>
+              </w:rPr>
+              <w:t>Número de ID</w:t>
+            </w:r>
+            <w:r>
+              <w:rPr>
+                <w:highlight w:val="yellow"/>
+              </w:rPr>
+              <w:t>]</w:t>
             </w:r>
             <w:r>
               <w:br/>
@@ -13509,8 +13189,8 @@
           <w:lang w:val="es-CO"/>
         </w:rPr>
         <w:sectPr>
-          <w:headerReference w:type="default" r:id="rId16"/>
-          <w:footerReference w:type="default" r:id="rId17"/>
+          <w:headerReference w:type="default" r:id="rId17"/>
+          <w:footerReference w:type="default" r:id="rId18"/>
           <w:pgSz w:w="12240" w:h="15840" w:code="1"/>
           <w:pgMar w:top="1134" w:right="1134" w:bottom="1134" w:left="1134" w:header="709" w:footer="709" w:gutter="0"/>
           <w:pgNumType w:start="1"/>
@@ -13520,7 +13200,7 @@
     </w:p>
     <w:p>
       <w:pPr>
-        <w:pStyle w:val="Ttulo1"/>
+        <w:pStyle w:val="Heading1"/>
         <w:numPr>
           <w:ilvl w:val="0"/>
           <w:numId w:val="0"/>
@@ -13542,7 +13222,7 @@
     </w:p>
     <w:p>
       <w:pPr>
-        <w:pStyle w:val="Prrafodelista"/>
+        <w:pStyle w:val="ListParagraph"/>
         <w:numPr>
           <w:ilvl w:val="0"/>
           <w:numId w:val="3"/>
@@ -13581,13 +13261,8 @@
         <w:t>valor Cupo de Operaciones en letras</w:t>
       </w:r>
       <w:r>
-        <w:t>] Dólares, (</w:t>
-      </w:r>
-      <w:proofErr w:type="gramStart"/>
-      <w:r>
-        <w:t>USD[</w:t>
-      </w:r>
-      <w:proofErr w:type="gramEnd"/>
+        <w:t>] Dólares, (USD[</w:t>
+      </w:r>
       <w:r>
         <w:rPr>
           <w:highlight w:val="yellow"/>
@@ -13600,7 +13275,7 @@
     </w:p>
     <w:p>
       <w:pPr>
-        <w:pStyle w:val="Prrafodelista"/>
+        <w:pStyle w:val="ListParagraph"/>
         <w:numPr>
           <w:ilvl w:val="0"/>
           <w:numId w:val="3"/>
@@ -13628,7 +13303,7 @@
     <w:bookmarkEnd w:id="123"/>
     <w:p>
       <w:pPr>
-        <w:pStyle w:val="Ttulo1"/>
+        <w:pStyle w:val="Heading1"/>
         <w:numPr>
           <w:ilvl w:val="0"/>
           <w:numId w:val="0"/>
@@ -13687,7 +13362,7 @@
     </w:p>
     <w:p>
       <w:pPr>
-        <w:pStyle w:val="Ttulo1"/>
+        <w:pStyle w:val="Heading1"/>
         <w:numPr>
           <w:ilvl w:val="0"/>
           <w:numId w:val="0"/>
@@ -13712,7 +13387,7 @@
     </w:p>
     <w:tbl>
       <w:tblPr>
-        <w:tblStyle w:val="Tablaconcuadrcula"/>
+        <w:tblStyle w:val="TableGrid"/>
         <w:tblW w:w="0" w:type="auto"/>
         <w:tblCellMar>
           <w:top w:w="57" w:type="dxa"/>
@@ -14401,17 +14076,8 @@
                 <w:sz w:val="18"/>
                 <w:szCs w:val="18"/>
               </w:rPr>
-              <w:t>] Dólares (</w:t>
-            </w:r>
-            <w:proofErr w:type="gramStart"/>
-            <w:r>
-              <w:rPr>
-                <w:sz w:val="18"/>
-                <w:szCs w:val="18"/>
-              </w:rPr>
-              <w:t>USD[</w:t>
-            </w:r>
-            <w:proofErr w:type="gramEnd"/>
+              <w:t>] Dólares (USD[</w:t>
+            </w:r>
             <w:r>
               <w:rPr>
                 <w:sz w:val="18"/>
@@ -14711,8 +14377,8 @@
       </w:pPr>
     </w:p>
     <w:sectPr>
-      <w:headerReference w:type="default" r:id="rId18"/>
-      <w:footerReference w:type="default" r:id="rId19"/>
+      <w:headerReference w:type="default" r:id="rId19"/>
+      <w:footerReference w:type="default" r:id="rId20"/>
       <w:pgSz w:w="12240" w:h="15840" w:code="1"/>
       <w:pgMar w:top="1134" w:right="1134" w:bottom="1134" w:left="1134" w:header="709" w:footer="709" w:gutter="0"/>
       <w:pgNumType w:fmt="lowerRoman" w:start="1"/>
@@ -14723,7 +14389,7 @@
 </file>
 
 <file path=word/endnotes.xml><?xml version="1.0" encoding="utf-8"?>
-<w:endnotes xmlns:wpc="http://schemas.microsoft.com/office/word/2010/wordprocessingCanvas" xmlns:cx="http://schemas.microsoft.com/office/drawing/2014/chartex" xmlns:cx1="http://schemas.microsoft.com/office/drawing/2015/9/8/chartex" xmlns:cx2="http://schemas.microsoft.com/office/drawing/2015/10/21/chartex" xmlns:cx3="http://schemas.microsoft.com/office/drawing/2016/5/9/chartex" xmlns:cx4="http://schemas.microsoft.com/office/drawing/2016/5/10/chartex" xmlns:cx5="http://schemas.microsoft.com/office/drawing/2016/5/11/chartex" xmlns:cx6="http://schemas.microsoft.com/office/drawing/2016/5/12/chartex" xmlns:cx7="http://schemas.microsoft.com/office/drawing/2016/5/13/chartex" xmlns:cx8="http://schemas.microsoft.com/office/drawing/2016/5/14/chartex" xmlns:mc="http://schemas.openxmlformats.org/markup-compatibility/2006" xmlns:aink="http://schemas.microsoft.com/office/drawing/2016/ink" xmlns:am3d="http://schemas.microsoft.com/office/drawing/2017/model3d" xmlns:o="urn:schemas-microsoft-com:office:office" xmlns:oel="http://schemas.microsoft.com/office/2019/extlst" xmlns:r="http://schemas.openxmlformats.org/officeDocument/2006/relationships" xmlns:m="http://schemas.openxmlformats.org/officeDocument/2006/math" xmlns:v="urn:schemas-microsoft-com:vml" xmlns:wp14="http://schemas.microsoft.com/office/word/2010/wordprocessingDrawing" xmlns:wp="http://schemas.openxmlformats.org/drawingml/2006/wordprocessingDrawing" xmlns:w10="urn:schemas-microsoft-com:office:word" xmlns:w="http://schemas.openxmlformats.org/wordprocessingml/2006/main" xmlns:w14="http://schemas.microsoft.com/office/word/2010/wordml" xmlns:w15="http://schemas.microsoft.com/office/word/2012/wordml" xmlns:w16cex="http://schemas.microsoft.com/office/word/2018/wordml/cex" xmlns:w16cid="http://schemas.microsoft.com/office/word/2016/wordml/cid" xmlns:w16="http://schemas.microsoft.com/office/word/2018/wordml" xmlns:w16du="http://schemas.microsoft.com/office/word/2023/wordml/word16du" xmlns:w16sdtdh="http://schemas.microsoft.com/office/word/2020/wordml/sdtdatahash" xmlns:w16sdtfl="http://schemas.microsoft.com/office/word/2024/wordml/sdtformatlock" xmlns:w16se="http://schemas.microsoft.com/office/word/2015/wordml/symex" xmlns:wpg="http://schemas.microsoft.com/office/word/2010/wordprocessingGroup" xmlns:wpi="http://schemas.microsoft.com/office/word/2010/wordprocessingInk" xmlns:wne="http://schemas.microsoft.com/office/word/2006/wordml" xmlns:wps="http://schemas.microsoft.com/office/word/2010/wordprocessingShape" mc:Ignorable="w14 w15 w16se w16cid w16 w16cex w16sdtdh w16sdtfl w16du wp14">
+<w:endnotes xmlns:wpc="http://schemas.microsoft.com/office/word/2010/wordprocessingCanvas" xmlns:cx="http://schemas.microsoft.com/office/drawing/2014/chartex" xmlns:cx1="http://schemas.microsoft.com/office/drawing/2015/9/8/chartex" xmlns:cx2="http://schemas.microsoft.com/office/drawing/2015/10/21/chartex" xmlns:cx3="http://schemas.microsoft.com/office/drawing/2016/5/9/chartex" xmlns:cx4="http://schemas.microsoft.com/office/drawing/2016/5/10/chartex" xmlns:cx5="http://schemas.microsoft.com/office/drawing/2016/5/11/chartex" xmlns:cx6="http://schemas.microsoft.com/office/drawing/2016/5/12/chartex" xmlns:cx7="http://schemas.microsoft.com/office/drawing/2016/5/13/chartex" xmlns:cx8="http://schemas.microsoft.com/office/drawing/2016/5/14/chartex" xmlns:mc="http://schemas.openxmlformats.org/markup-compatibility/2006" xmlns:aink="http://schemas.microsoft.com/office/drawing/2016/ink" xmlns:am3d="http://schemas.microsoft.com/office/drawing/2017/model3d" xmlns:o="urn:schemas-microsoft-com:office:office" xmlns:r="http://schemas.openxmlformats.org/officeDocument/2006/relationships" xmlns:m="http://schemas.openxmlformats.org/officeDocument/2006/math" xmlns:v="urn:schemas-microsoft-com:vml" xmlns:wp14="http://schemas.microsoft.com/office/word/2010/wordprocessingDrawing" xmlns:wp="http://schemas.openxmlformats.org/drawingml/2006/wordprocessingDrawing" xmlns:w10="urn:schemas-microsoft-com:office:word" xmlns:w="http://schemas.openxmlformats.org/wordprocessingml/2006/main" xmlns:w14="http://schemas.microsoft.com/office/word/2010/wordml" xmlns:w15="http://schemas.microsoft.com/office/word/2012/wordml" xmlns:w16cex="http://schemas.microsoft.com/office/word/2018/wordml/cex" xmlns:w16cid="http://schemas.microsoft.com/office/word/2016/wordml/cid" xmlns:w16="http://schemas.microsoft.com/office/word/2018/wordml" xmlns:w16se="http://schemas.microsoft.com/office/word/2015/wordml/symex" xmlns:wpg="http://schemas.microsoft.com/office/word/2010/wordprocessingGroup" xmlns:wpi="http://schemas.microsoft.com/office/word/2010/wordprocessingInk" xmlns:wne="http://schemas.microsoft.com/office/word/2006/wordml" xmlns:wps="http://schemas.microsoft.com/office/word/2010/wordprocessingShape" mc:Ignorable="w14 w15 w16se w16cid w16 w16cex wp14">
   <w:endnote w:type="separator" w:id="-1">
     <w:p>
       <w:r>
@@ -14745,7 +14411,7 @@
 </file>
 
 <file path=word/footer1.xml><?xml version="1.0" encoding="utf-8"?>
-<w:ftr xmlns:wpc="http://schemas.microsoft.com/office/word/2010/wordprocessingCanvas" xmlns:cx="http://schemas.microsoft.com/office/drawing/2014/chartex" xmlns:cx1="http://schemas.microsoft.com/office/drawing/2015/9/8/chartex" xmlns:cx2="http://schemas.microsoft.com/office/drawing/2015/10/21/chartex" xmlns:cx3="http://schemas.microsoft.com/office/drawing/2016/5/9/chartex" xmlns:cx4="http://schemas.microsoft.com/office/drawing/2016/5/10/chartex" xmlns:cx5="http://schemas.microsoft.com/office/drawing/2016/5/11/chartex" xmlns:cx6="http://schemas.microsoft.com/office/drawing/2016/5/12/chartex" xmlns:cx7="http://schemas.microsoft.com/office/drawing/2016/5/13/chartex" xmlns:cx8="http://schemas.microsoft.com/office/drawing/2016/5/14/chartex" xmlns:mc="http://schemas.openxmlformats.org/markup-compatibility/2006" xmlns:aink="http://schemas.microsoft.com/office/drawing/2016/ink" xmlns:am3d="http://schemas.microsoft.com/office/drawing/2017/model3d" xmlns:o="urn:schemas-microsoft-com:office:office" xmlns:oel="http://schemas.microsoft.com/office/2019/extlst" xmlns:r="http://schemas.openxmlformats.org/officeDocument/2006/relationships" xmlns:m="http://schemas.openxmlformats.org/officeDocument/2006/math" xmlns:v="urn:schemas-microsoft-com:vml" xmlns:wp14="http://schemas.microsoft.com/office/word/2010/wordprocessingDrawing" xmlns:wp="http://schemas.openxmlformats.org/drawingml/2006/wordprocessingDrawing" xmlns:w10="urn:schemas-microsoft-com:office:word" xmlns:w="http://schemas.openxmlformats.org/wordprocessingml/2006/main" xmlns:w14="http://schemas.microsoft.com/office/word/2010/wordml" xmlns:w15="http://schemas.microsoft.com/office/word/2012/wordml" xmlns:w16cex="http://schemas.microsoft.com/office/word/2018/wordml/cex" xmlns:w16cid="http://schemas.microsoft.com/office/word/2016/wordml/cid" xmlns:w16="http://schemas.microsoft.com/office/word/2018/wordml" xmlns:w16du="http://schemas.microsoft.com/office/word/2023/wordml/word16du" xmlns:w16sdtdh="http://schemas.microsoft.com/office/word/2020/wordml/sdtdatahash" xmlns:w16sdtfl="http://schemas.microsoft.com/office/word/2024/wordml/sdtformatlock" xmlns:w16se="http://schemas.microsoft.com/office/word/2015/wordml/symex" xmlns:wpg="http://schemas.microsoft.com/office/word/2010/wordprocessingGroup" xmlns:wpi="http://schemas.microsoft.com/office/word/2010/wordprocessingInk" xmlns:wne="http://schemas.microsoft.com/office/word/2006/wordml" xmlns:wps="http://schemas.microsoft.com/office/word/2010/wordprocessingShape" mc:Ignorable="w14 w15 w16se w16cid w16 w16cex w16sdtdh w16sdtfl w16du wp14">
+<w:ftr xmlns:wpc="http://schemas.microsoft.com/office/word/2010/wordprocessingCanvas" xmlns:cx="http://schemas.microsoft.com/office/drawing/2014/chartex" xmlns:cx1="http://schemas.microsoft.com/office/drawing/2015/9/8/chartex" xmlns:cx2="http://schemas.microsoft.com/office/drawing/2015/10/21/chartex" xmlns:cx3="http://schemas.microsoft.com/office/drawing/2016/5/9/chartex" xmlns:cx4="http://schemas.microsoft.com/office/drawing/2016/5/10/chartex" xmlns:cx5="http://schemas.microsoft.com/office/drawing/2016/5/11/chartex" xmlns:cx6="http://schemas.microsoft.com/office/drawing/2016/5/12/chartex" xmlns:cx7="http://schemas.microsoft.com/office/drawing/2016/5/13/chartex" xmlns:cx8="http://schemas.microsoft.com/office/drawing/2016/5/14/chartex" xmlns:mc="http://schemas.openxmlformats.org/markup-compatibility/2006" xmlns:aink="http://schemas.microsoft.com/office/drawing/2016/ink" xmlns:am3d="http://schemas.microsoft.com/office/drawing/2017/model3d" xmlns:o="urn:schemas-microsoft-com:office:office" xmlns:r="http://schemas.openxmlformats.org/officeDocument/2006/relationships" xmlns:m="http://schemas.openxmlformats.org/officeDocument/2006/math" xmlns:v="urn:schemas-microsoft-com:vml" xmlns:wp14="http://schemas.microsoft.com/office/word/2010/wordprocessingDrawing" xmlns:wp="http://schemas.openxmlformats.org/drawingml/2006/wordprocessingDrawing" xmlns:w10="urn:schemas-microsoft-com:office:word" xmlns:w="http://schemas.openxmlformats.org/wordprocessingml/2006/main" xmlns:w14="http://schemas.microsoft.com/office/word/2010/wordml" xmlns:w15="http://schemas.microsoft.com/office/word/2012/wordml" xmlns:w16cex="http://schemas.microsoft.com/office/word/2018/wordml/cex" xmlns:w16cid="http://schemas.microsoft.com/office/word/2016/wordml/cid" xmlns:w16="http://schemas.microsoft.com/office/word/2018/wordml" xmlns:w16se="http://schemas.microsoft.com/office/word/2015/wordml/symex" xmlns:wpg="http://schemas.microsoft.com/office/word/2010/wordprocessingGroup" xmlns:wpi="http://schemas.microsoft.com/office/word/2010/wordprocessingInk" xmlns:wne="http://schemas.microsoft.com/office/word/2006/wordml" xmlns:wps="http://schemas.microsoft.com/office/word/2010/wordprocessingShape" mc:Ignorable="w14 w15 w16se w16cid w16 w16cex wp14">
   <w:p>
     <w:pPr>
       <w:tabs>
@@ -14828,10 +14494,10 @@
 </file>
 
 <file path=word/footer2.xml><?xml version="1.0" encoding="utf-8"?>
-<w:ftr xmlns:wpc="http://schemas.microsoft.com/office/word/2010/wordprocessingCanvas" xmlns:cx="http://schemas.microsoft.com/office/drawing/2014/chartex" xmlns:cx1="http://schemas.microsoft.com/office/drawing/2015/9/8/chartex" xmlns:cx2="http://schemas.microsoft.com/office/drawing/2015/10/21/chartex" xmlns:cx3="http://schemas.microsoft.com/office/drawing/2016/5/9/chartex" xmlns:cx4="http://schemas.microsoft.com/office/drawing/2016/5/10/chartex" xmlns:cx5="http://schemas.microsoft.com/office/drawing/2016/5/11/chartex" xmlns:cx6="http://schemas.microsoft.com/office/drawing/2016/5/12/chartex" xmlns:cx7="http://schemas.microsoft.com/office/drawing/2016/5/13/chartex" xmlns:cx8="http://schemas.microsoft.com/office/drawing/2016/5/14/chartex" xmlns:mc="http://schemas.openxmlformats.org/markup-compatibility/2006" xmlns:aink="http://schemas.microsoft.com/office/drawing/2016/ink" xmlns:am3d="http://schemas.microsoft.com/office/drawing/2017/model3d" xmlns:o="urn:schemas-microsoft-com:office:office" xmlns:oel="http://schemas.microsoft.com/office/2019/extlst" xmlns:r="http://schemas.openxmlformats.org/officeDocument/2006/relationships" xmlns:m="http://schemas.openxmlformats.org/officeDocument/2006/math" xmlns:v="urn:schemas-microsoft-com:vml" xmlns:wp14="http://schemas.microsoft.com/office/word/2010/wordprocessingDrawing" xmlns:wp="http://schemas.openxmlformats.org/drawingml/2006/wordprocessingDrawing" xmlns:w10="urn:schemas-microsoft-com:office:word" xmlns:w="http://schemas.openxmlformats.org/wordprocessingml/2006/main" xmlns:w14="http://schemas.microsoft.com/office/word/2010/wordml" xmlns:w15="http://schemas.microsoft.com/office/word/2012/wordml" xmlns:w16cex="http://schemas.microsoft.com/office/word/2018/wordml/cex" xmlns:w16cid="http://schemas.microsoft.com/office/word/2016/wordml/cid" xmlns:w16="http://schemas.microsoft.com/office/word/2018/wordml" xmlns:w16du="http://schemas.microsoft.com/office/word/2023/wordml/word16du" xmlns:w16sdtdh="http://schemas.microsoft.com/office/word/2020/wordml/sdtdatahash" xmlns:w16sdtfl="http://schemas.microsoft.com/office/word/2024/wordml/sdtformatlock" xmlns:w16se="http://schemas.microsoft.com/office/word/2015/wordml/symex" xmlns:wpg="http://schemas.microsoft.com/office/word/2010/wordprocessingGroup" xmlns:wpi="http://schemas.microsoft.com/office/word/2010/wordprocessingInk" xmlns:wne="http://schemas.microsoft.com/office/word/2006/wordml" xmlns:wps="http://schemas.microsoft.com/office/word/2010/wordprocessingShape" mc:Ignorable="w14 w15 w16se w16cid w16 w16cex w16sdtdh w16sdtfl w16du wp14">
+<w:ftr xmlns:wpc="http://schemas.microsoft.com/office/word/2010/wordprocessingCanvas" xmlns:cx="http://schemas.microsoft.com/office/drawing/2014/chartex" xmlns:cx1="http://schemas.microsoft.com/office/drawing/2015/9/8/chartex" xmlns:cx2="http://schemas.microsoft.com/office/drawing/2015/10/21/chartex" xmlns:cx3="http://schemas.microsoft.com/office/drawing/2016/5/9/chartex" xmlns:cx4="http://schemas.microsoft.com/office/drawing/2016/5/10/chartex" xmlns:cx5="http://schemas.microsoft.com/office/drawing/2016/5/11/chartex" xmlns:cx6="http://schemas.microsoft.com/office/drawing/2016/5/12/chartex" xmlns:cx7="http://schemas.microsoft.com/office/drawing/2016/5/13/chartex" xmlns:cx8="http://schemas.microsoft.com/office/drawing/2016/5/14/chartex" xmlns:mc="http://schemas.openxmlformats.org/markup-compatibility/2006" xmlns:aink="http://schemas.microsoft.com/office/drawing/2016/ink" xmlns:am3d="http://schemas.microsoft.com/office/drawing/2017/model3d" xmlns:o="urn:schemas-microsoft-com:office:office" xmlns:r="http://schemas.openxmlformats.org/officeDocument/2006/relationships" xmlns:m="http://schemas.openxmlformats.org/officeDocument/2006/math" xmlns:v="urn:schemas-microsoft-com:vml" xmlns:wp14="http://schemas.microsoft.com/office/word/2010/wordprocessingDrawing" xmlns:wp="http://schemas.openxmlformats.org/drawingml/2006/wordprocessingDrawing" xmlns:w10="urn:schemas-microsoft-com:office:word" xmlns:w="http://schemas.openxmlformats.org/wordprocessingml/2006/main" xmlns:w14="http://schemas.microsoft.com/office/word/2010/wordml" xmlns:w15="http://schemas.microsoft.com/office/word/2012/wordml" xmlns:w16cex="http://schemas.microsoft.com/office/word/2018/wordml/cex" xmlns:w16cid="http://schemas.microsoft.com/office/word/2016/wordml/cid" xmlns:w16="http://schemas.microsoft.com/office/word/2018/wordml" xmlns:w16se="http://schemas.microsoft.com/office/word/2015/wordml/symex" xmlns:wpg="http://schemas.microsoft.com/office/word/2010/wordprocessingGroup" xmlns:wpi="http://schemas.microsoft.com/office/word/2010/wordprocessingInk" xmlns:wne="http://schemas.microsoft.com/office/word/2006/wordml" xmlns:wps="http://schemas.microsoft.com/office/word/2010/wordprocessingShape" mc:Ignorable="w14 w15 w16se w16cid w16 w16cex wp14">
   <w:p>
     <w:pPr>
-      <w:pStyle w:val="Piedepgina"/>
+      <w:pStyle w:val="Footer"/>
       <w:tabs>
         <w:tab w:val="clear" w:pos="4419"/>
         <w:tab w:val="center" w:pos="4962"/>
@@ -14892,7 +14558,7 @@
 </file>
 
 <file path=word/footnotes.xml><?xml version="1.0" encoding="utf-8"?>
-<w:footnotes xmlns:wpc="http://schemas.microsoft.com/office/word/2010/wordprocessingCanvas" xmlns:cx="http://schemas.microsoft.com/office/drawing/2014/chartex" xmlns:cx1="http://schemas.microsoft.com/office/drawing/2015/9/8/chartex" xmlns:cx2="http://schemas.microsoft.com/office/drawing/2015/10/21/chartex" xmlns:cx3="http://schemas.microsoft.com/office/drawing/2016/5/9/chartex" xmlns:cx4="http://schemas.microsoft.com/office/drawing/2016/5/10/chartex" xmlns:cx5="http://schemas.microsoft.com/office/drawing/2016/5/11/chartex" xmlns:cx6="http://schemas.microsoft.com/office/drawing/2016/5/12/chartex" xmlns:cx7="http://schemas.microsoft.com/office/drawing/2016/5/13/chartex" xmlns:cx8="http://schemas.microsoft.com/office/drawing/2016/5/14/chartex" xmlns:mc="http://schemas.openxmlformats.org/markup-compatibility/2006" xmlns:aink="http://schemas.microsoft.com/office/drawing/2016/ink" xmlns:am3d="http://schemas.microsoft.com/office/drawing/2017/model3d" xmlns:o="urn:schemas-microsoft-com:office:office" xmlns:oel="http://schemas.microsoft.com/office/2019/extlst" xmlns:r="http://schemas.openxmlformats.org/officeDocument/2006/relationships" xmlns:m="http://schemas.openxmlformats.org/officeDocument/2006/math" xmlns:v="urn:schemas-microsoft-com:vml" xmlns:wp14="http://schemas.microsoft.com/office/word/2010/wordprocessingDrawing" xmlns:wp="http://schemas.openxmlformats.org/drawingml/2006/wordprocessingDrawing" xmlns:w10="urn:schemas-microsoft-com:office:word" xmlns:w="http://schemas.openxmlformats.org/wordprocessingml/2006/main" xmlns:w14="http://schemas.microsoft.com/office/word/2010/wordml" xmlns:w15="http://schemas.microsoft.com/office/word/2012/wordml" xmlns:w16cex="http://schemas.microsoft.com/office/word/2018/wordml/cex" xmlns:w16cid="http://schemas.microsoft.com/office/word/2016/wordml/cid" xmlns:w16="http://schemas.microsoft.com/office/word/2018/wordml" xmlns:w16du="http://schemas.microsoft.com/office/word/2023/wordml/word16du" xmlns:w16sdtdh="http://schemas.microsoft.com/office/word/2020/wordml/sdtdatahash" xmlns:w16sdtfl="http://schemas.microsoft.com/office/word/2024/wordml/sdtformatlock" xmlns:w16se="http://schemas.microsoft.com/office/word/2015/wordml/symex" xmlns:wpg="http://schemas.microsoft.com/office/word/2010/wordprocessingGroup" xmlns:wpi="http://schemas.microsoft.com/office/word/2010/wordprocessingInk" xmlns:wne="http://schemas.microsoft.com/office/word/2006/wordml" xmlns:wps="http://schemas.microsoft.com/office/word/2010/wordprocessingShape" mc:Ignorable="w14 w15 w16se w16cid w16 w16cex w16sdtdh w16sdtfl w16du wp14">
+<w:footnotes xmlns:wpc="http://schemas.microsoft.com/office/word/2010/wordprocessingCanvas" xmlns:cx="http://schemas.microsoft.com/office/drawing/2014/chartex" xmlns:cx1="http://schemas.microsoft.com/office/drawing/2015/9/8/chartex" xmlns:cx2="http://schemas.microsoft.com/office/drawing/2015/10/21/chartex" xmlns:cx3="http://schemas.microsoft.com/office/drawing/2016/5/9/chartex" xmlns:cx4="http://schemas.microsoft.com/office/drawing/2016/5/10/chartex" xmlns:cx5="http://schemas.microsoft.com/office/drawing/2016/5/11/chartex" xmlns:cx6="http://schemas.microsoft.com/office/drawing/2016/5/12/chartex" xmlns:cx7="http://schemas.microsoft.com/office/drawing/2016/5/13/chartex" xmlns:cx8="http://schemas.microsoft.com/office/drawing/2016/5/14/chartex" xmlns:mc="http://schemas.openxmlformats.org/markup-compatibility/2006" xmlns:aink="http://schemas.microsoft.com/office/drawing/2016/ink" xmlns:am3d="http://schemas.microsoft.com/office/drawing/2017/model3d" xmlns:o="urn:schemas-microsoft-com:office:office" xmlns:r="http://schemas.openxmlformats.org/officeDocument/2006/relationships" xmlns:m="http://schemas.openxmlformats.org/officeDocument/2006/math" xmlns:v="urn:schemas-microsoft-com:vml" xmlns:wp14="http://schemas.microsoft.com/office/word/2010/wordprocessingDrawing" xmlns:wp="http://schemas.openxmlformats.org/drawingml/2006/wordprocessingDrawing" xmlns:w10="urn:schemas-microsoft-com:office:word" xmlns:w="http://schemas.openxmlformats.org/wordprocessingml/2006/main" xmlns:w14="http://schemas.microsoft.com/office/word/2010/wordml" xmlns:w15="http://schemas.microsoft.com/office/word/2012/wordml" xmlns:w16cex="http://schemas.microsoft.com/office/word/2018/wordml/cex" xmlns:w16cid="http://schemas.microsoft.com/office/word/2016/wordml/cid" xmlns:w16="http://schemas.microsoft.com/office/word/2018/wordml" xmlns:w16se="http://schemas.microsoft.com/office/word/2015/wordml/symex" xmlns:wpg="http://schemas.microsoft.com/office/word/2010/wordprocessingGroup" xmlns:wpi="http://schemas.microsoft.com/office/word/2010/wordprocessingInk" xmlns:wne="http://schemas.microsoft.com/office/word/2006/wordml" xmlns:wps="http://schemas.microsoft.com/office/word/2010/wordprocessingShape" mc:Ignorable="w14 w15 w16se w16cid w16 w16cex wp14">
   <w:footnote w:type="separator" w:id="-1">
     <w:p>
       <w:r>
@@ -14914,10 +14580,10 @@
 </file>
 
 <file path=word/header1.xml><?xml version="1.0" encoding="utf-8"?>
-<w:hdr xmlns:wpc="http://schemas.microsoft.com/office/word/2010/wordprocessingCanvas" xmlns:cx="http://schemas.microsoft.com/office/drawing/2014/chartex" xmlns:cx1="http://schemas.microsoft.com/office/drawing/2015/9/8/chartex" xmlns:cx2="http://schemas.microsoft.com/office/drawing/2015/10/21/chartex" xmlns:cx3="http://schemas.microsoft.com/office/drawing/2016/5/9/chartex" xmlns:cx4="http://schemas.microsoft.com/office/drawing/2016/5/10/chartex" xmlns:cx5="http://schemas.microsoft.com/office/drawing/2016/5/11/chartex" xmlns:cx6="http://schemas.microsoft.com/office/drawing/2016/5/12/chartex" xmlns:cx7="http://schemas.microsoft.com/office/drawing/2016/5/13/chartex" xmlns:cx8="http://schemas.microsoft.com/office/drawing/2016/5/14/chartex" xmlns:mc="http://schemas.openxmlformats.org/markup-compatibility/2006" xmlns:aink="http://schemas.microsoft.com/office/drawing/2016/ink" xmlns:am3d="http://schemas.microsoft.com/office/drawing/2017/model3d" xmlns:o="urn:schemas-microsoft-com:office:office" xmlns:oel="http://schemas.microsoft.com/office/2019/extlst" xmlns:r="http://schemas.openxmlformats.org/officeDocument/2006/relationships" xmlns:m="http://schemas.openxmlformats.org/officeDocument/2006/math" xmlns:v="urn:schemas-microsoft-com:vml" xmlns:wp14="http://schemas.microsoft.com/office/word/2010/wordprocessingDrawing" xmlns:wp="http://schemas.openxmlformats.org/drawingml/2006/wordprocessingDrawing" xmlns:w10="urn:schemas-microsoft-com:office:word" xmlns:w="http://schemas.openxmlformats.org/wordprocessingml/2006/main" xmlns:w14="http://schemas.microsoft.com/office/word/2010/wordml" xmlns:w15="http://schemas.microsoft.com/office/word/2012/wordml" xmlns:w16cex="http://schemas.microsoft.com/office/word/2018/wordml/cex" xmlns:w16cid="http://schemas.microsoft.com/office/word/2016/wordml/cid" xmlns:w16="http://schemas.microsoft.com/office/word/2018/wordml" xmlns:w16du="http://schemas.microsoft.com/office/word/2023/wordml/word16du" xmlns:w16sdtdh="http://schemas.microsoft.com/office/word/2020/wordml/sdtdatahash" xmlns:w16sdtfl="http://schemas.microsoft.com/office/word/2024/wordml/sdtformatlock" xmlns:w16se="http://schemas.microsoft.com/office/word/2015/wordml/symex" xmlns:wpg="http://schemas.microsoft.com/office/word/2010/wordprocessingGroup" xmlns:wpi="http://schemas.microsoft.com/office/word/2010/wordprocessingInk" xmlns:wne="http://schemas.microsoft.com/office/word/2006/wordml" xmlns:wps="http://schemas.microsoft.com/office/word/2010/wordprocessingShape" mc:Ignorable="w14 w15 w16se w16cid w16 w16cex w16sdtdh w16sdtfl w16du wp14">
+<w:hdr xmlns:wpc="http://schemas.microsoft.com/office/word/2010/wordprocessingCanvas" xmlns:cx="http://schemas.microsoft.com/office/drawing/2014/chartex" xmlns:cx1="http://schemas.microsoft.com/office/drawing/2015/9/8/chartex" xmlns:cx2="http://schemas.microsoft.com/office/drawing/2015/10/21/chartex" xmlns:cx3="http://schemas.microsoft.com/office/drawing/2016/5/9/chartex" xmlns:cx4="http://schemas.microsoft.com/office/drawing/2016/5/10/chartex" xmlns:cx5="http://schemas.microsoft.com/office/drawing/2016/5/11/chartex" xmlns:cx6="http://schemas.microsoft.com/office/drawing/2016/5/12/chartex" xmlns:cx7="http://schemas.microsoft.com/office/drawing/2016/5/13/chartex" xmlns:cx8="http://schemas.microsoft.com/office/drawing/2016/5/14/chartex" xmlns:mc="http://schemas.openxmlformats.org/markup-compatibility/2006" xmlns:aink="http://schemas.microsoft.com/office/drawing/2016/ink" xmlns:am3d="http://schemas.microsoft.com/office/drawing/2017/model3d" xmlns:o="urn:schemas-microsoft-com:office:office" xmlns:r="http://schemas.openxmlformats.org/officeDocument/2006/relationships" xmlns:m="http://schemas.openxmlformats.org/officeDocument/2006/math" xmlns:v="urn:schemas-microsoft-com:vml" xmlns:wp14="http://schemas.microsoft.com/office/word/2010/wordprocessingDrawing" xmlns:wp="http://schemas.openxmlformats.org/drawingml/2006/wordprocessingDrawing" xmlns:w10="urn:schemas-microsoft-com:office:word" xmlns:w="http://schemas.openxmlformats.org/wordprocessingml/2006/main" xmlns:w14="http://schemas.microsoft.com/office/word/2010/wordml" xmlns:w15="http://schemas.microsoft.com/office/word/2012/wordml" xmlns:w16cex="http://schemas.microsoft.com/office/word/2018/wordml/cex" xmlns:w16cid="http://schemas.microsoft.com/office/word/2016/wordml/cid" xmlns:w16="http://schemas.microsoft.com/office/word/2018/wordml" xmlns:w16se="http://schemas.microsoft.com/office/word/2015/wordml/symex" xmlns:wpg="http://schemas.microsoft.com/office/word/2010/wordprocessingGroup" xmlns:wpi="http://schemas.microsoft.com/office/word/2010/wordprocessingInk" xmlns:wne="http://schemas.microsoft.com/office/word/2006/wordml" xmlns:wps="http://schemas.microsoft.com/office/word/2010/wordprocessingShape" mc:Ignorable="w14 w15 w16se w16cid w16 w16cex wp14">
   <w:p>
     <w:pPr>
-      <w:pStyle w:val="Encabezado"/>
+      <w:pStyle w:val="Header"/>
       <w:spacing w:after="240"/>
       <w:jc w:val="right"/>
     </w:pPr>
@@ -14972,10 +14638,10 @@
 </file>
 
 <file path=word/header2.xml><?xml version="1.0" encoding="utf-8"?>
-<w:hdr xmlns:wpc="http://schemas.microsoft.com/office/word/2010/wordprocessingCanvas" xmlns:cx="http://schemas.microsoft.com/office/drawing/2014/chartex" xmlns:cx1="http://schemas.microsoft.com/office/drawing/2015/9/8/chartex" xmlns:cx2="http://schemas.microsoft.com/office/drawing/2015/10/21/chartex" xmlns:cx3="http://schemas.microsoft.com/office/drawing/2016/5/9/chartex" xmlns:cx4="http://schemas.microsoft.com/office/drawing/2016/5/10/chartex" xmlns:cx5="http://schemas.microsoft.com/office/drawing/2016/5/11/chartex" xmlns:cx6="http://schemas.microsoft.com/office/drawing/2016/5/12/chartex" xmlns:cx7="http://schemas.microsoft.com/office/drawing/2016/5/13/chartex" xmlns:cx8="http://schemas.microsoft.com/office/drawing/2016/5/14/chartex" xmlns:mc="http://schemas.openxmlformats.org/markup-compatibility/2006" xmlns:aink="http://schemas.microsoft.com/office/drawing/2016/ink" xmlns:am3d="http://schemas.microsoft.com/office/drawing/2017/model3d" xmlns:o="urn:schemas-microsoft-com:office:office" xmlns:oel="http://schemas.microsoft.com/office/2019/extlst" xmlns:r="http://schemas.openxmlformats.org/officeDocument/2006/relationships" xmlns:m="http://schemas.openxmlformats.org/officeDocument/2006/math" xmlns:v="urn:schemas-microsoft-com:vml" xmlns:wp14="http://schemas.microsoft.com/office/word/2010/wordprocessingDrawing" xmlns:wp="http://schemas.openxmlformats.org/drawingml/2006/wordprocessingDrawing" xmlns:w10="urn:schemas-microsoft-com:office:word" xmlns:w="http://schemas.openxmlformats.org/wordprocessingml/2006/main" xmlns:w14="http://schemas.microsoft.com/office/word/2010/wordml" xmlns:w15="http://schemas.microsoft.com/office/word/2012/wordml" xmlns:w16cex="http://schemas.microsoft.com/office/word/2018/wordml/cex" xmlns:w16cid="http://schemas.microsoft.com/office/word/2016/wordml/cid" xmlns:w16="http://schemas.microsoft.com/office/word/2018/wordml" xmlns:w16du="http://schemas.microsoft.com/office/word/2023/wordml/word16du" xmlns:w16sdtdh="http://schemas.microsoft.com/office/word/2020/wordml/sdtdatahash" xmlns:w16sdtfl="http://schemas.microsoft.com/office/word/2024/wordml/sdtformatlock" xmlns:w16se="http://schemas.microsoft.com/office/word/2015/wordml/symex" xmlns:wpg="http://schemas.microsoft.com/office/word/2010/wordprocessingGroup" xmlns:wpi="http://schemas.microsoft.com/office/word/2010/wordprocessingInk" xmlns:wne="http://schemas.microsoft.com/office/word/2006/wordml" xmlns:wps="http://schemas.microsoft.com/office/word/2010/wordprocessingShape" mc:Ignorable="w14 w15 w16se w16cid w16 w16cex w16sdtdh w16sdtfl w16du wp14">
+<w:hdr xmlns:wpc="http://schemas.microsoft.com/office/word/2010/wordprocessingCanvas" xmlns:cx="http://schemas.microsoft.com/office/drawing/2014/chartex" xmlns:cx1="http://schemas.microsoft.com/office/drawing/2015/9/8/chartex" xmlns:cx2="http://schemas.microsoft.com/office/drawing/2015/10/21/chartex" xmlns:cx3="http://schemas.microsoft.com/office/drawing/2016/5/9/chartex" xmlns:cx4="http://schemas.microsoft.com/office/drawing/2016/5/10/chartex" xmlns:cx5="http://schemas.microsoft.com/office/drawing/2016/5/11/chartex" xmlns:cx6="http://schemas.microsoft.com/office/drawing/2016/5/12/chartex" xmlns:cx7="http://schemas.microsoft.com/office/drawing/2016/5/13/chartex" xmlns:cx8="http://schemas.microsoft.com/office/drawing/2016/5/14/chartex" xmlns:mc="http://schemas.openxmlformats.org/markup-compatibility/2006" xmlns:aink="http://schemas.microsoft.com/office/drawing/2016/ink" xmlns:am3d="http://schemas.microsoft.com/office/drawing/2017/model3d" xmlns:o="urn:schemas-microsoft-com:office:office" xmlns:r="http://schemas.openxmlformats.org/officeDocument/2006/relationships" xmlns:m="http://schemas.openxmlformats.org/officeDocument/2006/math" xmlns:v="urn:schemas-microsoft-com:vml" xmlns:wp14="http://schemas.microsoft.com/office/word/2010/wordprocessingDrawing" xmlns:wp="http://schemas.openxmlformats.org/drawingml/2006/wordprocessingDrawing" xmlns:w10="urn:schemas-microsoft-com:office:word" xmlns:w="http://schemas.openxmlformats.org/wordprocessingml/2006/main" xmlns:w14="http://schemas.microsoft.com/office/word/2010/wordml" xmlns:w15="http://schemas.microsoft.com/office/word/2012/wordml" xmlns:w16cex="http://schemas.microsoft.com/office/word/2018/wordml/cex" xmlns:w16cid="http://schemas.microsoft.com/office/word/2016/wordml/cid" xmlns:w16="http://schemas.microsoft.com/office/word/2018/wordml" xmlns:w16se="http://schemas.microsoft.com/office/word/2015/wordml/symex" xmlns:wpg="http://schemas.microsoft.com/office/word/2010/wordprocessingGroup" xmlns:wpi="http://schemas.microsoft.com/office/word/2010/wordprocessingInk" xmlns:wne="http://schemas.microsoft.com/office/word/2006/wordml" xmlns:wps="http://schemas.microsoft.com/office/word/2010/wordprocessingShape" mc:Ignorable="w14 w15 w16se w16cid w16 w16cex wp14">
   <w:p>
     <w:pPr>
-      <w:pStyle w:val="Encabezado"/>
+      <w:pStyle w:val="Header"/>
       <w:spacing w:after="240"/>
       <w:jc w:val="right"/>
     </w:pPr>
@@ -15030,7 +14696,7 @@
 </file>
 
 <file path=word/numbering.xml><?xml version="1.0" encoding="utf-8"?>
-<w:numbering xmlns:wpc="http://schemas.microsoft.com/office/word/2010/wordprocessingCanvas" xmlns:cx="http://schemas.microsoft.com/office/drawing/2014/chartex" xmlns:cx1="http://schemas.microsoft.com/office/drawing/2015/9/8/chartex" xmlns:cx2="http://schemas.microsoft.com/office/drawing/2015/10/21/chartex" xmlns:cx3="http://schemas.microsoft.com/office/drawing/2016/5/9/chartex" xmlns:cx4="http://schemas.microsoft.com/office/drawing/2016/5/10/chartex" xmlns:cx5="http://schemas.microsoft.com/office/drawing/2016/5/11/chartex" xmlns:cx6="http://schemas.microsoft.com/office/drawing/2016/5/12/chartex" xmlns:cx7="http://schemas.microsoft.com/office/drawing/2016/5/13/chartex" xmlns:cx8="http://schemas.microsoft.com/office/drawing/2016/5/14/chartex" xmlns:mc="http://schemas.openxmlformats.org/markup-compatibility/2006" xmlns:aink="http://schemas.microsoft.com/office/drawing/2016/ink" xmlns:am3d="http://schemas.microsoft.com/office/drawing/2017/model3d" xmlns:o="urn:schemas-microsoft-com:office:office" xmlns:oel="http://schemas.microsoft.com/office/2019/extlst" xmlns:r="http://schemas.openxmlformats.org/officeDocument/2006/relationships" xmlns:m="http://schemas.openxmlformats.org/officeDocument/2006/math" xmlns:v="urn:schemas-microsoft-com:vml" xmlns:wp14="http://schemas.microsoft.com/office/word/2010/wordprocessingDrawing" xmlns:wp="http://schemas.openxmlformats.org/drawingml/2006/wordprocessingDrawing" xmlns:w10="urn:schemas-microsoft-com:office:word" xmlns:w="http://schemas.openxmlformats.org/wordprocessingml/2006/main" xmlns:w14="http://schemas.microsoft.com/office/word/2010/wordml" xmlns:w15="http://schemas.microsoft.com/office/word/2012/wordml" xmlns:w16cex="http://schemas.microsoft.com/office/word/2018/wordml/cex" xmlns:w16cid="http://schemas.microsoft.com/office/word/2016/wordml/cid" xmlns:w16="http://schemas.microsoft.com/office/word/2018/wordml" xmlns:w16du="http://schemas.microsoft.com/office/word/2023/wordml/word16du" xmlns:w16sdtdh="http://schemas.microsoft.com/office/word/2020/wordml/sdtdatahash" xmlns:w16sdtfl="http://schemas.microsoft.com/office/word/2024/wordml/sdtformatlock" xmlns:w16se="http://schemas.microsoft.com/office/word/2015/wordml/symex" xmlns:wpg="http://schemas.microsoft.com/office/word/2010/wordprocessingGroup" xmlns:wpi="http://schemas.microsoft.com/office/word/2010/wordprocessingInk" xmlns:wne="http://schemas.microsoft.com/office/word/2006/wordml" xmlns:wps="http://schemas.microsoft.com/office/word/2010/wordprocessingShape" mc:Ignorable="w14 w15 w16se w16cid w16 w16cex w16sdtdh w16sdtfl w16du wp14">
+<w:numbering xmlns:wpc="http://schemas.microsoft.com/office/word/2010/wordprocessingCanvas" xmlns:cx="http://schemas.microsoft.com/office/drawing/2014/chartex" xmlns:cx1="http://schemas.microsoft.com/office/drawing/2015/9/8/chartex" xmlns:cx2="http://schemas.microsoft.com/office/drawing/2015/10/21/chartex" xmlns:cx3="http://schemas.microsoft.com/office/drawing/2016/5/9/chartex" xmlns:cx4="http://schemas.microsoft.com/office/drawing/2016/5/10/chartex" xmlns:cx5="http://schemas.microsoft.com/office/drawing/2016/5/11/chartex" xmlns:cx6="http://schemas.microsoft.com/office/drawing/2016/5/12/chartex" xmlns:cx7="http://schemas.microsoft.com/office/drawing/2016/5/13/chartex" xmlns:cx8="http://schemas.microsoft.com/office/drawing/2016/5/14/chartex" xmlns:mc="http://schemas.openxmlformats.org/markup-compatibility/2006" xmlns:aink="http://schemas.microsoft.com/office/drawing/2016/ink" xmlns:am3d="http://schemas.microsoft.com/office/drawing/2017/model3d" xmlns:o="urn:schemas-microsoft-com:office:office" xmlns:r="http://schemas.openxmlformats.org/officeDocument/2006/relationships" xmlns:m="http://schemas.openxmlformats.org/officeDocument/2006/math" xmlns:v="urn:schemas-microsoft-com:vml" xmlns:wp14="http://schemas.microsoft.com/office/word/2010/wordprocessingDrawing" xmlns:wp="http://schemas.openxmlformats.org/drawingml/2006/wordprocessingDrawing" xmlns:w10="urn:schemas-microsoft-com:office:word" xmlns:w="http://schemas.openxmlformats.org/wordprocessingml/2006/main" xmlns:w14="http://schemas.microsoft.com/office/word/2010/wordml" xmlns:w15="http://schemas.microsoft.com/office/word/2012/wordml" xmlns:w16cex="http://schemas.microsoft.com/office/word/2018/wordml/cex" xmlns:w16cid="http://schemas.microsoft.com/office/word/2016/wordml/cid" xmlns:w16="http://schemas.microsoft.com/office/word/2018/wordml" xmlns:w16se="http://schemas.microsoft.com/office/word/2015/wordml/symex" xmlns:wpg="http://schemas.microsoft.com/office/word/2010/wordprocessingGroup" xmlns:wpi="http://schemas.microsoft.com/office/word/2010/wordprocessingInk" xmlns:wne="http://schemas.microsoft.com/office/word/2006/wordml" xmlns:wps="http://schemas.microsoft.com/office/word/2010/wordprocessingShape" mc:Ignorable="w14 w15 w16se w16cid w16 w16cex wp14">
   <w:abstractNum w:abstractNumId="0" w15:restartNumberingAfterBreak="0">
     <w:nsid w:val="196312A4"/>
     <w:multiLevelType w:val="hybridMultilevel"/>
@@ -15221,7 +14887,7 @@
     <w:lvl w:ilvl="0">
       <w:start w:val="1"/>
       <w:numFmt w:val="upperRoman"/>
-      <w:pStyle w:val="Ttulo1"/>
+      <w:pStyle w:val="Heading1"/>
       <w:suff w:val="nothing"/>
       <w:lvlText w:val="Artículo %1"/>
       <w:lvlJc w:val="left"/>
@@ -15252,7 +14918,7 @@
     <w:lvl w:ilvl="1">
       <w:start w:val="1"/>
       <w:numFmt w:val="decimalZero"/>
-      <w:pStyle w:val="Ttulo2"/>
+      <w:pStyle w:val="Heading2"/>
       <w:isLgl/>
       <w:lvlText w:val="Sección %1.%2"/>
       <w:lvlJc w:val="left"/>
@@ -15284,7 +14950,7 @@
     <w:lvl w:ilvl="2">
       <w:start w:val="1"/>
       <w:numFmt w:val="lowerLetter"/>
-      <w:pStyle w:val="Ttulo3"/>
+      <w:pStyle w:val="Heading3"/>
       <w:lvlText w:val="(%3)"/>
       <w:lvlJc w:val="left"/>
       <w:pPr>
@@ -15315,7 +14981,7 @@
     <w:lvl w:ilvl="3">
       <w:start w:val="1"/>
       <w:numFmt w:val="lowerRoman"/>
-      <w:pStyle w:val="Ttulo4"/>
+      <w:pStyle w:val="Heading4"/>
       <w:lvlText w:val="(%4)"/>
       <w:lvlJc w:val="left"/>
       <w:pPr>
@@ -16416,13 +16082,13 @@
       </w:pPr>
     </w:lvl>
   </w:abstractNum>
-  <w:num w:numId="1" w16cid:durableId="1421020225">
+  <w:num w:numId="1">
     <w:abstractNumId w:val="2"/>
   </w:num>
-  <w:num w:numId="2" w16cid:durableId="1369138248">
+  <w:num w:numId="2">
     <w:abstractNumId w:val="1"/>
   </w:num>
-  <w:num w:numId="3" w16cid:durableId="271978574">
+  <w:num w:numId="3">
     <w:abstractNumId w:val="6"/>
     <w:lvlOverride w:ilvl="0">
       <w:startOverride w:val="1"/>
@@ -16452,13 +16118,13 @@
       <w:startOverride w:val="1"/>
     </w:lvlOverride>
   </w:num>
-  <w:num w:numId="4" w16cid:durableId="1137986841">
+  <w:num w:numId="4">
     <w:abstractNumId w:val="4"/>
   </w:num>
-  <w:num w:numId="5" w16cid:durableId="1302929283">
+  <w:num w:numId="5">
     <w:abstractNumId w:val="0"/>
   </w:num>
-  <w:num w:numId="6" w16cid:durableId="839276057">
+  <w:num w:numId="6">
     <w:abstractNumId w:val="2"/>
     <w:lvlOverride w:ilvl="0">
       <w:startOverride w:val="1"/>
@@ -16488,136 +16154,136 @@
       <w:startOverride w:val="1"/>
     </w:lvlOverride>
   </w:num>
-  <w:num w:numId="7" w16cid:durableId="2124688584">
+  <w:num w:numId="7">
     <w:abstractNumId w:val="3"/>
   </w:num>
-  <w:num w:numId="8" w16cid:durableId="921059825">
+  <w:num w:numId="8">
     <w:abstractNumId w:val="10"/>
   </w:num>
-  <w:num w:numId="9" w16cid:durableId="673916264">
+  <w:num w:numId="9">
     <w:abstractNumId w:val="2"/>
   </w:num>
-  <w:num w:numId="10" w16cid:durableId="336663601">
+  <w:num w:numId="10">
     <w:abstractNumId w:val="7"/>
   </w:num>
-  <w:num w:numId="11" w16cid:durableId="1246646982">
+  <w:num w:numId="11">
     <w:abstractNumId w:val="5"/>
   </w:num>
-  <w:num w:numId="12" w16cid:durableId="1682731230">
+  <w:num w:numId="12">
     <w:abstractNumId w:val="5"/>
     <w:lvlOverride w:ilvl="0">
       <w:startOverride w:val="1"/>
     </w:lvlOverride>
   </w:num>
-  <w:num w:numId="13" w16cid:durableId="1102258874">
+  <w:num w:numId="13">
     <w:abstractNumId w:val="5"/>
     <w:lvlOverride w:ilvl="0">
       <w:startOverride w:val="1"/>
     </w:lvlOverride>
   </w:num>
-  <w:num w:numId="14" w16cid:durableId="1618634249">
+  <w:num w:numId="14">
     <w:abstractNumId w:val="5"/>
     <w:lvlOverride w:ilvl="0">
       <w:startOverride w:val="1"/>
     </w:lvlOverride>
   </w:num>
-  <w:num w:numId="15" w16cid:durableId="864247099">
+  <w:num w:numId="15">
     <w:abstractNumId w:val="5"/>
     <w:lvlOverride w:ilvl="0">
       <w:startOverride w:val="1"/>
     </w:lvlOverride>
   </w:num>
-  <w:num w:numId="16" w16cid:durableId="1884369213">
+  <w:num w:numId="16">
     <w:abstractNumId w:val="5"/>
     <w:lvlOverride w:ilvl="0">
       <w:startOverride w:val="1"/>
     </w:lvlOverride>
   </w:num>
-  <w:num w:numId="17" w16cid:durableId="621573517">
+  <w:num w:numId="17">
     <w:abstractNumId w:val="5"/>
     <w:lvlOverride w:ilvl="0">
       <w:startOverride w:val="1"/>
     </w:lvlOverride>
   </w:num>
-  <w:num w:numId="18" w16cid:durableId="1783182687">
+  <w:num w:numId="18">
     <w:abstractNumId w:val="5"/>
     <w:lvlOverride w:ilvl="0">
       <w:startOverride w:val="1"/>
     </w:lvlOverride>
   </w:num>
-  <w:num w:numId="19" w16cid:durableId="848644638">
+  <w:num w:numId="19">
     <w:abstractNumId w:val="5"/>
     <w:lvlOverride w:ilvl="0">
       <w:startOverride w:val="1"/>
     </w:lvlOverride>
   </w:num>
-  <w:num w:numId="20" w16cid:durableId="692194431">
+  <w:num w:numId="20">
     <w:abstractNumId w:val="5"/>
     <w:lvlOverride w:ilvl="0">
       <w:startOverride w:val="1"/>
     </w:lvlOverride>
   </w:num>
-  <w:num w:numId="21" w16cid:durableId="209995453">
+  <w:num w:numId="21">
     <w:abstractNumId w:val="5"/>
     <w:lvlOverride w:ilvl="0">
       <w:startOverride w:val="1"/>
     </w:lvlOverride>
   </w:num>
-  <w:num w:numId="22" w16cid:durableId="37360941">
+  <w:num w:numId="22">
     <w:abstractNumId w:val="5"/>
     <w:lvlOverride w:ilvl="0">
       <w:startOverride w:val="1"/>
     </w:lvlOverride>
   </w:num>
-  <w:num w:numId="23" w16cid:durableId="620915306">
+  <w:num w:numId="23">
     <w:abstractNumId w:val="5"/>
     <w:lvlOverride w:ilvl="0">
       <w:startOverride w:val="1"/>
     </w:lvlOverride>
   </w:num>
-  <w:num w:numId="24" w16cid:durableId="718017175">
+  <w:num w:numId="24">
     <w:abstractNumId w:val="5"/>
     <w:lvlOverride w:ilvl="0">
       <w:startOverride w:val="1"/>
     </w:lvlOverride>
   </w:num>
-  <w:num w:numId="25" w16cid:durableId="1318654268">
+  <w:num w:numId="25">
     <w:abstractNumId w:val="5"/>
     <w:lvlOverride w:ilvl="0">
       <w:startOverride w:val="1"/>
     </w:lvlOverride>
   </w:num>
-  <w:num w:numId="26" w16cid:durableId="1813206358">
+  <w:num w:numId="26">
     <w:abstractNumId w:val="5"/>
     <w:lvlOverride w:ilvl="0">
       <w:startOverride w:val="1"/>
     </w:lvlOverride>
   </w:num>
-  <w:num w:numId="27" w16cid:durableId="153224466">
+  <w:num w:numId="27">
     <w:abstractNumId w:val="5"/>
     <w:lvlOverride w:ilvl="0">
       <w:startOverride w:val="1"/>
     </w:lvlOverride>
   </w:num>
-  <w:num w:numId="28" w16cid:durableId="775173172">
+  <w:num w:numId="28">
     <w:abstractNumId w:val="5"/>
     <w:lvlOverride w:ilvl="0">
       <w:startOverride w:val="1"/>
     </w:lvlOverride>
   </w:num>
-  <w:num w:numId="29" w16cid:durableId="1339380090">
+  <w:num w:numId="29">
     <w:abstractNumId w:val="5"/>
     <w:lvlOverride w:ilvl="0">
       <w:startOverride w:val="1"/>
     </w:lvlOverride>
   </w:num>
-  <w:num w:numId="30" w16cid:durableId="1791895798">
+  <w:num w:numId="30">
     <w:abstractNumId w:val="11"/>
   </w:num>
-  <w:num w:numId="31" w16cid:durableId="368533933">
+  <w:num w:numId="31">
     <w:abstractNumId w:val="8"/>
   </w:num>
-  <w:num w:numId="32" w16cid:durableId="1341812493">
+  <w:num w:numId="32">
     <w:abstractNumId w:val="2"/>
     <w:lvlOverride w:ilvl="0">
       <w:startOverride w:val="1"/>
@@ -16647,7 +16313,7 @@
       <w:startOverride w:val="1"/>
     </w:lvlOverride>
   </w:num>
-  <w:num w:numId="33" w16cid:durableId="2086878427">
+  <w:num w:numId="33">
     <w:abstractNumId w:val="9"/>
   </w:num>
   <w:numIdMacAtCleanup w:val="8"/>
@@ -16655,7 +16321,7 @@
 </file>
 
 <file path=word/styles.xml><?xml version="1.0" encoding="utf-8"?>
-<w:styles xmlns:mc="http://schemas.openxmlformats.org/markup-compatibility/2006" xmlns:r="http://schemas.openxmlformats.org/officeDocument/2006/relationships" xmlns:w="http://schemas.openxmlformats.org/wordprocessingml/2006/main" xmlns:w14="http://schemas.microsoft.com/office/word/2010/wordml" xmlns:w15="http://schemas.microsoft.com/office/word/2012/wordml" xmlns:w16cex="http://schemas.microsoft.com/office/word/2018/wordml/cex" xmlns:w16cid="http://schemas.microsoft.com/office/word/2016/wordml/cid" xmlns:w16="http://schemas.microsoft.com/office/word/2018/wordml" xmlns:w16du="http://schemas.microsoft.com/office/word/2023/wordml/word16du" xmlns:w16sdtdh="http://schemas.microsoft.com/office/word/2020/wordml/sdtdatahash" xmlns:w16sdtfl="http://schemas.microsoft.com/office/word/2024/wordml/sdtformatlock" xmlns:w16se="http://schemas.microsoft.com/office/word/2015/wordml/symex" mc:Ignorable="w14 w15 w16se w16cid w16 w16cex w16sdtdh w16sdtfl w16du">
+<w:styles xmlns:mc="http://schemas.openxmlformats.org/markup-compatibility/2006" xmlns:r="http://schemas.openxmlformats.org/officeDocument/2006/relationships" xmlns:w="http://schemas.openxmlformats.org/wordprocessingml/2006/main" xmlns:w14="http://schemas.microsoft.com/office/word/2010/wordml" xmlns:w15="http://schemas.microsoft.com/office/word/2012/wordml" xmlns:w16cex="http://schemas.microsoft.com/office/word/2018/wordml/cex" xmlns:w16cid="http://schemas.microsoft.com/office/word/2016/wordml/cid" xmlns:w16="http://schemas.microsoft.com/office/word/2018/wordml" xmlns:w16se="http://schemas.microsoft.com/office/word/2015/wordml/symex" mc:Ignorable="w14 w15 w16se w16cid w16 w16cex">
   <w:docDefaults>
     <w:rPrDefault>
       <w:rPr>
@@ -17064,12 +16730,12 @@
       <w:lang w:eastAsia="en-US"/>
     </w:rPr>
   </w:style>
-  <w:style w:type="paragraph" w:styleId="Ttulo1">
+  <w:style w:type="paragraph" w:styleId="Heading1">
     <w:name w:val="heading 1"/>
     <w:aliases w:val="H1,H1-Heading 1,Header 1,Heading 0,Hoofdstukkop,Legal Line 1,Lev 1,MT1,Niveau 1,SECTION,Section,Section Heading,Titulo 1,h1,head 1,l1,level 1,level1,título 1,título 11,título 111,título 112,título 12,título 13,título 14,título 15,1,CLÁUSULAS"/>
     <w:basedOn w:val="Normal"/>
     <w:next w:val="Normal"/>
-    <w:link w:val="Ttulo1Car"/>
+    <w:link w:val="Heading1Char"/>
     <w:uiPriority w:val="9"/>
     <w:qFormat/>
     <w:rsid w:val="00105DD4"/>
@@ -17086,12 +16752,12 @@
       <w:u w:val="single"/>
     </w:rPr>
   </w:style>
-  <w:style w:type="paragraph" w:styleId="Ttulo2">
+  <w:style w:type="paragraph" w:styleId="Heading2">
     <w:name w:val="heading 2"/>
     <w:aliases w:val="1_ Título 2,2,21,22,Clause,H2,Jhed2,Lev 2,Major,Niveau 1 1,Paragraafkop,Reset numbering,Título 2 Car Car,Título 2 Car Car Car Car,Título 2 Car1,Título 2 Car1 Car Car,h2,level 2,level2,no section,section header,sub-sect,sub-sect1,DM,H2 Char,D"/>
     <w:basedOn w:val="Normal"/>
     <w:next w:val="Normal"/>
-    <w:link w:val="Ttulo2Car"/>
+    <w:link w:val="Heading2Char"/>
     <w:uiPriority w:val="9"/>
     <w:unhideWhenUsed/>
     <w:qFormat/>
@@ -17109,12 +16775,12 @@
       <w:u w:val="single"/>
     </w:rPr>
   </w:style>
-  <w:style w:type="paragraph" w:styleId="Ttulo3">
+  <w:style w:type="paragraph" w:styleId="Heading3">
     <w:name w:val="heading 3"/>
     <w:aliases w:val="(a),3,31,32,33,34,35,H3,H31,H32,Heading 3(left),Lev 3,Level 1 - 1,Minor,Niveau 1 1 1,Subhead B,Subparagraafkop,h3,h31,h32,h33,h34,h35,level 3,level3,sub section header,sub-sub,sub-sub1,sub-sub2,sub-sub3,sub-sub4,title,Style 46,BONUS-T3 Final"/>
     <w:basedOn w:val="Normal"/>
     <w:next w:val="Normal"/>
-    <w:link w:val="Ttulo3Car"/>
+    <w:link w:val="Heading3Char"/>
     <w:unhideWhenUsed/>
     <w:qFormat/>
     <w:rsid w:val="00105DD4"/>
@@ -17131,12 +16797,12 @@
       <w:lang w:val="es-CO"/>
     </w:rPr>
   </w:style>
-  <w:style w:type="paragraph" w:styleId="Ttulo4">
+  <w:style w:type="paragraph" w:styleId="Heading4">
     <w:name w:val="heading 4"/>
     <w:aliases w:val="(i),4,H,H4,Lev 4,Level 2 - a,Sub-Minor,level 4,level4"/>
     <w:basedOn w:val="Normal"/>
     <w:next w:val="Normal"/>
-    <w:link w:val="Ttulo4Car"/>
+    <w:link w:val="Heading4Char"/>
     <w:unhideWhenUsed/>
     <w:qFormat/>
     <w:rsid w:val="00676869"/>
@@ -17153,11 +16819,11 @@
       <w:szCs w:val="24"/>
     </w:rPr>
   </w:style>
-  <w:style w:type="paragraph" w:styleId="Ttulo5">
+  <w:style w:type="paragraph" w:styleId="Heading5">
     <w:name w:val="heading 5"/>
     <w:basedOn w:val="Normal"/>
     <w:next w:val="Normal"/>
-    <w:link w:val="Ttulo5Car"/>
+    <w:link w:val="Heading5Char"/>
     <w:unhideWhenUsed/>
     <w:qFormat/>
     <w:rsid w:val="00105DD4"/>
@@ -17174,12 +16840,12 @@
       <w:szCs w:val="24"/>
     </w:rPr>
   </w:style>
-  <w:style w:type="paragraph" w:styleId="Ttulo6">
+  <w:style w:type="paragraph" w:styleId="Heading6">
     <w:name w:val="heading 6"/>
     <w:aliases w:val="H6"/>
     <w:basedOn w:val="Normal"/>
     <w:next w:val="Normal"/>
-    <w:link w:val="Ttulo6Car"/>
+    <w:link w:val="Heading6Char"/>
     <w:uiPriority w:val="9"/>
     <w:unhideWhenUsed/>
     <w:qFormat/>
@@ -17197,11 +16863,11 @@
       <w:szCs w:val="24"/>
     </w:rPr>
   </w:style>
-  <w:style w:type="paragraph" w:styleId="Ttulo7">
+  <w:style w:type="paragraph" w:styleId="Heading7">
     <w:name w:val="heading 7"/>
     <w:basedOn w:val="Normal"/>
     <w:next w:val="Normal"/>
-    <w:link w:val="Ttulo7Car"/>
+    <w:link w:val="Heading7Char"/>
     <w:uiPriority w:val="9"/>
     <w:unhideWhenUsed/>
     <w:qFormat/>
@@ -17221,11 +16887,11 @@
       <w:szCs w:val="24"/>
     </w:rPr>
   </w:style>
-  <w:style w:type="paragraph" w:styleId="Ttulo8">
+  <w:style w:type="paragraph" w:styleId="Heading8">
     <w:name w:val="heading 8"/>
     <w:basedOn w:val="Normal"/>
     <w:next w:val="Normal"/>
-    <w:link w:val="Ttulo8Car"/>
+    <w:link w:val="Heading8Char"/>
     <w:uiPriority w:val="9"/>
     <w:unhideWhenUsed/>
     <w:qFormat/>
@@ -17243,11 +16909,11 @@
       <w:szCs w:val="21"/>
     </w:rPr>
   </w:style>
-  <w:style w:type="paragraph" w:styleId="Ttulo9">
+  <w:style w:type="paragraph" w:styleId="Heading9">
     <w:name w:val="heading 9"/>
     <w:basedOn w:val="Normal"/>
     <w:next w:val="Normal"/>
-    <w:link w:val="Ttulo9Car"/>
+    <w:link w:val="Heading9Char"/>
     <w:uiPriority w:val="9"/>
     <w:unhideWhenUsed/>
     <w:qFormat/>
@@ -17267,13 +16933,13 @@
       <w:szCs w:val="21"/>
     </w:rPr>
   </w:style>
-  <w:style w:type="character" w:default="1" w:styleId="Fuentedeprrafopredeter">
+  <w:style w:type="character" w:default="1" w:styleId="DefaultParagraphFont">
     <w:name w:val="Default Paragraph Font"/>
     <w:uiPriority w:val="1"/>
     <w:semiHidden/>
     <w:unhideWhenUsed/>
   </w:style>
-  <w:style w:type="table" w:default="1" w:styleId="Tablanormal">
+  <w:style w:type="table" w:default="1" w:styleId="TableNormal">
     <w:name w:val="Normal Table"/>
     <w:uiPriority w:val="99"/>
     <w:semiHidden/>
@@ -17288,7 +16954,7 @@
       </w:tblCellMar>
     </w:tblPr>
   </w:style>
-  <w:style w:type="numbering" w:default="1" w:styleId="Sinlista">
+  <w:style w:type="numbering" w:default="1" w:styleId="NoList">
     <w:name w:val="No List"/>
     <w:uiPriority w:val="99"/>
     <w:semiHidden/>
@@ -17305,7 +16971,7 @@
       </w:tblCellMar>
     </w:tblPr>
   </w:style>
-  <w:style w:type="paragraph" w:styleId="Ttulo">
+  <w:style w:type="paragraph" w:styleId="Title">
     <w:name w:val="Title"/>
     <w:basedOn w:val="Normal"/>
     <w:next w:val="Normal"/>
@@ -17320,11 +16986,11 @@
       <w:szCs w:val="72"/>
     </w:rPr>
   </w:style>
-  <w:style w:type="character" w:customStyle="1" w:styleId="Ttulo1Car">
-    <w:name w:val="Título 1 Car"/>
-    <w:aliases w:val="H1 Car,H1-Heading 1 Car,Header 1 Car,Heading 0 Car,Hoofdstukkop Car,Legal Line 1 Car,Lev 1 Car,MT1 Car,Niveau 1 Car,SECTION Car,Section Car,Section Heading Car,Titulo 1 Car,h1 Car,head 1 Car,l1 Car,level 1 Car,level1 Car,título 1 Car,1 Car"/>
-    <w:basedOn w:val="Fuentedeprrafopredeter"/>
-    <w:link w:val="Ttulo1"/>
+  <w:style w:type="character" w:customStyle="1" w:styleId="Heading1Char">
+    <w:name w:val="Heading 1 Char"/>
+    <w:aliases w:val="H1 Char,H1-Heading 1 Char,Header 1 Char,Heading 0 Char,Hoofdstukkop Char,Legal Line 1 Char,Lev 1 Char,MT1 Char,Niveau 1 Char,SECTION Char,Section Char,Section Heading Char,Titulo 1 Char,h1 Char,head 1 Char,l1 Char,level 1 Char,level1 Char"/>
+    <w:basedOn w:val="DefaultParagraphFont"/>
+    <w:link w:val="Heading1"/>
     <w:uiPriority w:val="2"/>
     <w:rsid w:val="00676869"/>
     <w:rPr>
@@ -17336,11 +17002,11 @@
       <w:lang w:eastAsia="en-US"/>
     </w:rPr>
   </w:style>
-  <w:style w:type="character" w:customStyle="1" w:styleId="Ttulo2Car">
-    <w:name w:val="Título 2 Car"/>
-    <w:aliases w:val="1_ Título 2 Car,2 Car,21 Car,22 Car,Clause Car,H2 Car,Jhed2 Car,Lev 2 Car,Major Car,Niveau 1 1 Car,Paragraafkop Car,Reset numbering Car,Título 2 Car Car Car,Título 2 Car Car Car Car Car,Título 2 Car1 Car,Título 2 Car1 Car Car Car,h2 Car"/>
-    <w:basedOn w:val="Fuentedeprrafopredeter"/>
-    <w:link w:val="Ttulo2"/>
+  <w:style w:type="character" w:customStyle="1" w:styleId="Heading2Char">
+    <w:name w:val="Heading 2 Char"/>
+    <w:aliases w:val="1_ Título 2 Char,2 Char,21 Char,22 Char,Clause Char,H2 Char1,Jhed2 Char,Lev 2 Char,Major Char,Niveau 1 1 Char,Paragraafkop Char,Reset numbering Char,Título 2 Car Car Char,Título 2 Car Car Car Car Char,Título 2 Car1 Char,h2 Char,DM Char"/>
+    <w:basedOn w:val="DefaultParagraphFont"/>
+    <w:link w:val="Heading2"/>
     <w:uiPriority w:val="9"/>
     <w:rsid w:val="00676869"/>
     <w:rPr>
@@ -17351,11 +17017,11 @@
       <w:lang w:eastAsia="en-US"/>
     </w:rPr>
   </w:style>
-  <w:style w:type="character" w:customStyle="1" w:styleId="Ttulo3Car">
-    <w:name w:val="Título 3 Car"/>
-    <w:aliases w:val="(a) Car,3 Car,31 Car,32 Car,33 Car,34 Car,35 Car,H3 Car,H31 Car,H32 Car,Heading 3(left) Car,Lev 3 Car,Level 1 - 1 Car,Minor Car,Niveau 1 1 1 Car,Subhead B Car,Subparagraafkop Car,h3 Car,h31 Car,h32 Car,h33 Car,h34 Car,h35 Car,level 3 Car"/>
-    <w:basedOn w:val="Fuentedeprrafopredeter"/>
-    <w:link w:val="Ttulo3"/>
+  <w:style w:type="character" w:customStyle="1" w:styleId="Heading3Char">
+    <w:name w:val="Heading 3 Char"/>
+    <w:aliases w:val="(a) Char,3 Char,31 Char,32 Char,33 Char,34 Char,35 Char,H3 Char,H31 Char,H32 Char,Heading 3(left) Char,Lev 3 Char,Level 1 - 1 Char,Minor Char,Niveau 1 1 1 Char,Subhead B Char,Subparagraafkop Char,h3 Char,h31 Char,h32 Char,h33 Char"/>
+    <w:basedOn w:val="DefaultParagraphFont"/>
+    <w:link w:val="Heading3"/>
     <w:rsid w:val="00676869"/>
     <w:rPr>
       <w:rFonts w:ascii="Open Sans" w:eastAsiaTheme="majorEastAsia" w:hAnsi="Open Sans" w:cstheme="majorBidi"/>
@@ -17364,11 +17030,11 @@
       <w:lang w:val="es-CO" w:eastAsia="en-US"/>
     </w:rPr>
   </w:style>
-  <w:style w:type="character" w:customStyle="1" w:styleId="Ttulo4Car">
-    <w:name w:val="Título 4 Car"/>
-    <w:aliases w:val="(i) Car,4 Car,H Car,H4 Car,Lev 4 Car,Level 2 - a Car,Sub-Minor Car,level 4 Car,level4 Car"/>
-    <w:basedOn w:val="Fuentedeprrafopredeter"/>
-    <w:link w:val="Ttulo4"/>
+  <w:style w:type="character" w:customStyle="1" w:styleId="Heading4Char">
+    <w:name w:val="Heading 4 Char"/>
+    <w:aliases w:val="(i) Char,4 Char,H Char,H4 Char,Lev 4 Char,Level 2 - a Char,Sub-Minor Char,level 4 Char,level4 Char"/>
+    <w:basedOn w:val="DefaultParagraphFont"/>
+    <w:link w:val="Heading4"/>
     <w:rsid w:val="00676869"/>
     <w:rPr>
       <w:rFonts w:ascii="Open Sans" w:eastAsiaTheme="majorEastAsia" w:hAnsi="Open Sans" w:cstheme="majorBidi"/>
@@ -17378,10 +17044,10 @@
       <w:lang w:eastAsia="en-US"/>
     </w:rPr>
   </w:style>
-  <w:style w:type="character" w:customStyle="1" w:styleId="Ttulo5Car">
-    <w:name w:val="Título 5 Car"/>
-    <w:basedOn w:val="Fuentedeprrafopredeter"/>
-    <w:link w:val="Ttulo5"/>
+  <w:style w:type="character" w:customStyle="1" w:styleId="Heading5Char">
+    <w:name w:val="Heading 5 Char"/>
+    <w:basedOn w:val="DefaultParagraphFont"/>
+    <w:link w:val="Heading5"/>
     <w:rsid w:val="00B2500A"/>
     <w:rPr>
       <w:rFonts w:asciiTheme="majorHAnsi" w:eastAsiaTheme="majorEastAsia" w:hAnsiTheme="majorHAnsi" w:cstheme="majorBidi"/>
@@ -17391,11 +17057,11 @@
       <w:lang w:eastAsia="en-US"/>
     </w:rPr>
   </w:style>
-  <w:style w:type="character" w:customStyle="1" w:styleId="Ttulo6Car">
-    <w:name w:val="Título 6 Car"/>
-    <w:aliases w:val="H6 Car"/>
-    <w:basedOn w:val="Fuentedeprrafopredeter"/>
-    <w:link w:val="Ttulo6"/>
+  <w:style w:type="character" w:customStyle="1" w:styleId="Heading6Char">
+    <w:name w:val="Heading 6 Char"/>
+    <w:aliases w:val="H6 Char"/>
+    <w:basedOn w:val="DefaultParagraphFont"/>
+    <w:link w:val="Heading6"/>
     <w:rsid w:val="00B2500A"/>
     <w:rPr>
       <w:rFonts w:asciiTheme="majorHAnsi" w:eastAsiaTheme="majorEastAsia" w:hAnsiTheme="majorHAnsi" w:cstheme="majorBidi"/>
@@ -17405,10 +17071,10 @@
       <w:lang w:eastAsia="en-US"/>
     </w:rPr>
   </w:style>
-  <w:style w:type="character" w:customStyle="1" w:styleId="Ttulo7Car">
-    <w:name w:val="Título 7 Car"/>
-    <w:basedOn w:val="Fuentedeprrafopredeter"/>
-    <w:link w:val="Ttulo7"/>
+  <w:style w:type="character" w:customStyle="1" w:styleId="Heading7Char">
+    <w:name w:val="Heading 7 Char"/>
+    <w:basedOn w:val="DefaultParagraphFont"/>
+    <w:link w:val="Heading7"/>
     <w:rsid w:val="00B2500A"/>
     <w:rPr>
       <w:rFonts w:asciiTheme="majorHAnsi" w:eastAsiaTheme="majorEastAsia" w:hAnsiTheme="majorHAnsi" w:cstheme="majorBidi"/>
@@ -17420,10 +17086,10 @@
       <w:lang w:eastAsia="en-US"/>
     </w:rPr>
   </w:style>
-  <w:style w:type="character" w:customStyle="1" w:styleId="Ttulo8Car">
-    <w:name w:val="Título 8 Car"/>
-    <w:basedOn w:val="Fuentedeprrafopredeter"/>
-    <w:link w:val="Ttulo8"/>
+  <w:style w:type="character" w:customStyle="1" w:styleId="Heading8Char">
+    <w:name w:val="Heading 8 Char"/>
+    <w:basedOn w:val="DefaultParagraphFont"/>
+    <w:link w:val="Heading8"/>
     <w:rsid w:val="00B2500A"/>
     <w:rPr>
       <w:rFonts w:asciiTheme="majorHAnsi" w:eastAsiaTheme="majorEastAsia" w:hAnsiTheme="majorHAnsi" w:cstheme="majorBidi"/>
@@ -17433,10 +17099,10 @@
       <w:lang w:eastAsia="en-US"/>
     </w:rPr>
   </w:style>
-  <w:style w:type="character" w:customStyle="1" w:styleId="Ttulo9Car">
-    <w:name w:val="Título 9 Car"/>
-    <w:basedOn w:val="Fuentedeprrafopredeter"/>
-    <w:link w:val="Ttulo9"/>
+  <w:style w:type="character" w:customStyle="1" w:styleId="Heading9Char">
+    <w:name w:val="Heading 9 Char"/>
+    <w:basedOn w:val="DefaultParagraphFont"/>
+    <w:link w:val="Heading9"/>
     <w:rsid w:val="00B2500A"/>
     <w:rPr>
       <w:rFonts w:asciiTheme="majorHAnsi" w:eastAsiaTheme="majorEastAsia" w:hAnsiTheme="majorHAnsi" w:cstheme="majorBidi"/>
@@ -17448,11 +17114,11 @@
       <w:lang w:eastAsia="en-US"/>
     </w:rPr>
   </w:style>
-  <w:style w:type="paragraph" w:styleId="Prrafodelista">
+  <w:style w:type="paragraph" w:styleId="ListParagraph">
     <w:name w:val="List Paragraph"/>
     <w:aliases w:val="Título1,Colorful List - Accent 11,Bolita,Párrafo antic,BOLADEF,Párrafo de lista2,Párrafo de lista3,Párrafo de lista21,BOLA,1. Anexo,Colorful List Accent 1,EY EPM - Lista,Estilo 3,Guión,HOJA,Lista vistosa - Énfasis 11,NORMAL,Viñetas,Ha"/>
     <w:basedOn w:val="Normal"/>
-    <w:link w:val="PrrafodelistaCar"/>
+    <w:link w:val="ListParagraphChar"/>
     <w:uiPriority w:val="34"/>
     <w:qFormat/>
     <w:rsid w:val="00B2500A"/>
@@ -17461,9 +17127,9 @@
       <w:contextualSpacing/>
     </w:pPr>
   </w:style>
-  <w:style w:type="character" w:styleId="Refdecomentario">
+  <w:style w:type="character" w:styleId="CommentReference">
     <w:name w:val="annotation reference"/>
-    <w:basedOn w:val="Fuentedeprrafopredeter"/>
+    <w:basedOn w:val="DefaultParagraphFont"/>
     <w:uiPriority w:val="99"/>
     <w:semiHidden/>
     <w:unhideWhenUsed/>
@@ -17473,10 +17139,10 @@
       <w:szCs w:val="16"/>
     </w:rPr>
   </w:style>
-  <w:style w:type="paragraph" w:styleId="Textocomentario">
+  <w:style w:type="paragraph" w:styleId="CommentText">
     <w:name w:val="annotation text"/>
     <w:basedOn w:val="Normal"/>
-    <w:link w:val="TextocomentarioCar"/>
+    <w:link w:val="CommentTextChar"/>
     <w:uiPriority w:val="99"/>
     <w:unhideWhenUsed/>
     <w:rsid w:val="00105DD4"/>
@@ -17484,10 +17150,10 @@
       <w:szCs w:val="20"/>
     </w:rPr>
   </w:style>
-  <w:style w:type="character" w:customStyle="1" w:styleId="TextocomentarioCar">
-    <w:name w:val="Texto comentario Car"/>
-    <w:basedOn w:val="Fuentedeprrafopredeter"/>
-    <w:link w:val="Textocomentario"/>
+  <w:style w:type="character" w:customStyle="1" w:styleId="CommentTextChar">
+    <w:name w:val="Comment Text Char"/>
+    <w:basedOn w:val="DefaultParagraphFont"/>
+    <w:link w:val="CommentText"/>
     <w:uiPriority w:val="99"/>
     <w:rsid w:val="00B2500A"/>
     <w:rPr>
@@ -17497,10 +17163,10 @@
       <w:lang w:eastAsia="en-US"/>
     </w:rPr>
   </w:style>
-  <w:style w:type="paragraph" w:styleId="Textoindependiente">
+  <w:style w:type="paragraph" w:styleId="BodyText">
     <w:name w:val="Body Text"/>
     <w:basedOn w:val="Normal"/>
-    <w:link w:val="TextoindependienteCar"/>
+    <w:link w:val="BodyTextChar"/>
     <w:rsid w:val="00105DD4"/>
     <w:pPr>
       <w:spacing w:after="0"/>
@@ -17510,10 +17176,10 @@
       <w:szCs w:val="20"/>
     </w:rPr>
   </w:style>
-  <w:style w:type="character" w:customStyle="1" w:styleId="TextoindependienteCar">
-    <w:name w:val="Texto independiente Car"/>
-    <w:basedOn w:val="Fuentedeprrafopredeter"/>
-    <w:link w:val="Textoindependiente"/>
+  <w:style w:type="character" w:customStyle="1" w:styleId="BodyTextChar">
+    <w:name w:val="Body Text Char"/>
+    <w:basedOn w:val="DefaultParagraphFont"/>
+    <w:link w:val="BodyText"/>
     <w:rsid w:val="00B2500A"/>
     <w:rPr>
       <w:rFonts w:ascii="Georgia" w:eastAsia="Times New Roman" w:hAnsi="Georgia" w:cs="Times New Roman"/>
@@ -17522,19 +17188,19 @@
       <w:lang w:eastAsia="en-US"/>
     </w:rPr>
   </w:style>
-  <w:style w:type="character" w:customStyle="1" w:styleId="PrrafodelistaCar">
-    <w:name w:val="Párrafo de lista Car"/>
-    <w:aliases w:val="Título1 Car,Colorful List - Accent 11 Car,Bolita Car,Párrafo antic Car,BOLADEF Car,Párrafo de lista2 Car,Párrafo de lista3 Car,Párrafo de lista21 Car,BOLA Car,1. Anexo Car,Colorful List Accent 1 Car,EY EPM - Lista Car,Estilo 3 Car"/>
-    <w:link w:val="Prrafodelista"/>
+  <w:style w:type="character" w:customStyle="1" w:styleId="ListParagraphChar">
+    <w:name w:val="List Paragraph Char"/>
+    <w:aliases w:val="Título1 Char,Colorful List - Accent 11 Char,Bolita Char,Párrafo antic Char,BOLADEF Char,Párrafo de lista2 Char,Párrafo de lista3 Char,Párrafo de lista21 Char,BOLA Char,1. Anexo Char,Colorful List Accent 1 Char,EY EPM - Lista Char"/>
+    <w:link w:val="ListParagraph"/>
     <w:uiPriority w:val="34"/>
     <w:qFormat/>
     <w:locked/>
     <w:rsid w:val="00B2500A"/>
   </w:style>
-  <w:style w:type="paragraph" w:styleId="Textodeglobo">
+  <w:style w:type="paragraph" w:styleId="BalloonText">
     <w:name w:val="Balloon Text"/>
     <w:basedOn w:val="Normal"/>
-    <w:link w:val="TextodegloboCar"/>
+    <w:link w:val="BalloonTextChar"/>
     <w:uiPriority w:val="99"/>
     <w:semiHidden/>
     <w:unhideWhenUsed/>
@@ -17548,10 +17214,10 @@
       <w:szCs w:val="18"/>
     </w:rPr>
   </w:style>
-  <w:style w:type="character" w:customStyle="1" w:styleId="TextodegloboCar">
-    <w:name w:val="Texto de globo Car"/>
-    <w:basedOn w:val="Fuentedeprrafopredeter"/>
-    <w:link w:val="Textodeglobo"/>
+  <w:style w:type="character" w:customStyle="1" w:styleId="BalloonTextChar">
+    <w:name w:val="Balloon Text Char"/>
+    <w:basedOn w:val="DefaultParagraphFont"/>
+    <w:link w:val="BalloonText"/>
     <w:uiPriority w:val="99"/>
     <w:semiHidden/>
     <w:rsid w:val="00B2500A"/>
@@ -17561,7 +17227,7 @@
       <w:szCs w:val="18"/>
     </w:rPr>
   </w:style>
-  <w:style w:type="paragraph" w:styleId="Subttulo">
+  <w:style w:type="paragraph" w:styleId="Subtitle">
     <w:name w:val="Subtitle"/>
     <w:basedOn w:val="Normal"/>
     <w:next w:val="Normal"/>
@@ -17589,11 +17255,11 @@
       </w:tblCellMar>
     </w:tblPr>
   </w:style>
-  <w:style w:type="paragraph" w:styleId="Asuntodelcomentario">
+  <w:style w:type="paragraph" w:styleId="CommentSubject">
     <w:name w:val="annotation subject"/>
-    <w:basedOn w:val="Textocomentario"/>
-    <w:next w:val="Textocomentario"/>
-    <w:link w:val="AsuntodelcomentarioCar"/>
+    <w:basedOn w:val="CommentText"/>
+    <w:next w:val="CommentText"/>
+    <w:link w:val="CommentSubjectChar"/>
     <w:uiPriority w:val="99"/>
     <w:semiHidden/>
     <w:unhideWhenUsed/>
@@ -17603,10 +17269,10 @@
       <w:bCs/>
     </w:rPr>
   </w:style>
-  <w:style w:type="character" w:customStyle="1" w:styleId="AsuntodelcomentarioCar">
-    <w:name w:val="Asunto del comentario Car"/>
-    <w:basedOn w:val="TextocomentarioCar"/>
-    <w:link w:val="Asuntodelcomentario"/>
+  <w:style w:type="character" w:customStyle="1" w:styleId="CommentSubjectChar">
+    <w:name w:val="Comment Subject Char"/>
+    <w:basedOn w:val="CommentTextChar"/>
+    <w:link w:val="CommentSubject"/>
     <w:uiPriority w:val="99"/>
     <w:semiHidden/>
     <w:rsid w:val="00052007"/>
@@ -17619,7 +17285,7 @@
       <w:lang w:eastAsia="en-US"/>
     </w:rPr>
   </w:style>
-  <w:style w:type="paragraph" w:styleId="Revisin">
+  <w:style w:type="paragraph" w:styleId="Revision">
     <w:name w:val="Revision"/>
     <w:hidden/>
     <w:uiPriority w:val="99"/>
@@ -17629,10 +17295,10 @@
       <w:spacing w:after="0" w:line="240" w:lineRule="auto"/>
     </w:pPr>
   </w:style>
-  <w:style w:type="paragraph" w:styleId="Textonotapie">
+  <w:style w:type="paragraph" w:styleId="FootnoteText">
     <w:name w:val="footnote text"/>
     <w:basedOn w:val="Normal"/>
-    <w:link w:val="TextonotapieCar"/>
+    <w:link w:val="FootnoteTextChar"/>
     <w:uiPriority w:val="99"/>
     <w:semiHidden/>
     <w:unhideWhenUsed/>
@@ -17644,10 +17310,10 @@
       <w:szCs w:val="20"/>
     </w:rPr>
   </w:style>
-  <w:style w:type="character" w:customStyle="1" w:styleId="TextonotapieCar">
-    <w:name w:val="Texto nota pie Car"/>
-    <w:basedOn w:val="Fuentedeprrafopredeter"/>
-    <w:link w:val="Textonotapie"/>
+  <w:style w:type="character" w:customStyle="1" w:styleId="FootnoteTextChar">
+    <w:name w:val="Footnote Text Char"/>
+    <w:basedOn w:val="DefaultParagraphFont"/>
+    <w:link w:val="FootnoteText"/>
     <w:uiPriority w:val="99"/>
     <w:semiHidden/>
     <w:rsid w:val="000C6FAC"/>
@@ -17658,10 +17324,10 @@
       <w:lang w:eastAsia="en-US"/>
     </w:rPr>
   </w:style>
-  <w:style w:type="character" w:styleId="Refdenotaalpie">
+  <w:style w:type="character" w:styleId="FootnoteReference">
     <w:name w:val="footnote reference"/>
     <w:aliases w:val="Style 24,fr,Ref. de nota al pi"/>
-    <w:basedOn w:val="Fuentedeprrafopredeter"/>
+    <w:basedOn w:val="DefaultParagraphFont"/>
     <w:uiPriority w:val="99"/>
     <w:unhideWhenUsed/>
     <w:qFormat/>
@@ -17670,9 +17336,9 @@
       <w:vertAlign w:val="superscript"/>
     </w:rPr>
   </w:style>
-  <w:style w:type="character" w:styleId="Hipervnculo">
+  <w:style w:type="character" w:styleId="Hyperlink">
     <w:name w:val="Hyperlink"/>
-    <w:basedOn w:val="Fuentedeprrafopredeter"/>
+    <w:basedOn w:val="DefaultParagraphFont"/>
     <w:uiPriority w:val="99"/>
     <w:unhideWhenUsed/>
     <w:rsid w:val="00105DD4"/>
@@ -17681,9 +17347,9 @@
       <w:u w:val="single"/>
     </w:rPr>
   </w:style>
-  <w:style w:type="character" w:styleId="Mencinsinresolver">
+  <w:style w:type="character" w:styleId="UnresolvedMention">
     <w:name w:val="Unresolved Mention"/>
-    <w:basedOn w:val="Fuentedeprrafopredeter"/>
+    <w:basedOn w:val="DefaultParagraphFont"/>
     <w:uiPriority w:val="99"/>
     <w:semiHidden/>
     <w:unhideWhenUsed/>
@@ -17693,10 +17359,10 @@
       <w:shd w:val="clear" w:color="auto" w:fill="E1DFDD"/>
     </w:rPr>
   </w:style>
-  <w:style w:type="paragraph" w:styleId="Encabezado">
+  <w:style w:type="paragraph" w:styleId="Header">
     <w:name w:val="header"/>
     <w:basedOn w:val="Normal"/>
-    <w:link w:val="EncabezadoCar"/>
+    <w:link w:val="HeaderChar"/>
     <w:uiPriority w:val="99"/>
     <w:unhideWhenUsed/>
     <w:rsid w:val="0002232A"/>
@@ -17708,20 +17374,20 @@
       <w:spacing w:after="0"/>
     </w:pPr>
   </w:style>
-  <w:style w:type="character" w:customStyle="1" w:styleId="EncabezadoCar">
-    <w:name w:val="Encabezado Car"/>
-    <w:basedOn w:val="Fuentedeprrafopredeter"/>
-    <w:link w:val="Encabezado"/>
+  <w:style w:type="character" w:customStyle="1" w:styleId="HeaderChar">
+    <w:name w:val="Header Char"/>
+    <w:basedOn w:val="DefaultParagraphFont"/>
+    <w:link w:val="Header"/>
     <w:uiPriority w:val="99"/>
     <w:rsid w:val="0002232A"/>
     <w:rPr>
       <w:rFonts w:ascii="Times New Roman" w:hAnsi="Times New Roman"/>
     </w:rPr>
   </w:style>
-  <w:style w:type="paragraph" w:styleId="Piedepgina">
+  <w:style w:type="paragraph" w:styleId="Footer">
     <w:name w:val="footer"/>
     <w:basedOn w:val="Normal"/>
-    <w:link w:val="PiedepginaCar"/>
+    <w:link w:val="FooterChar"/>
     <w:uiPriority w:val="99"/>
     <w:unhideWhenUsed/>
     <w:rsid w:val="0002232A"/>
@@ -17733,19 +17399,19 @@
       <w:spacing w:after="0"/>
     </w:pPr>
   </w:style>
-  <w:style w:type="character" w:customStyle="1" w:styleId="PiedepginaCar">
-    <w:name w:val="Pie de página Car"/>
-    <w:basedOn w:val="Fuentedeprrafopredeter"/>
-    <w:link w:val="Piedepgina"/>
+  <w:style w:type="character" w:customStyle="1" w:styleId="FooterChar">
+    <w:name w:val="Footer Char"/>
+    <w:basedOn w:val="DefaultParagraphFont"/>
+    <w:link w:val="Footer"/>
     <w:uiPriority w:val="99"/>
     <w:rsid w:val="0002232A"/>
     <w:rPr>
       <w:rFonts w:ascii="Times New Roman" w:hAnsi="Times New Roman"/>
     </w:rPr>
   </w:style>
-  <w:style w:type="table" w:styleId="Tablaconcuadrcula">
+  <w:style w:type="table" w:styleId="TableGrid">
     <w:name w:val="Table Grid"/>
-    <w:basedOn w:val="Tablanormal"/>
+    <w:basedOn w:val="TableNormal"/>
     <w:uiPriority w:val="39"/>
     <w:rsid w:val="00065E02"/>
     <w:pPr>
@@ -17784,7 +17450,7 @@
       <w:lang w:val="es-CO" w:eastAsia="en-US"/>
     </w:rPr>
   </w:style>
-  <w:style w:type="paragraph" w:styleId="Lista">
+  <w:style w:type="paragraph" w:styleId="List">
     <w:name w:val="List"/>
     <w:basedOn w:val="Normal"/>
     <w:uiPriority w:val="99"/>
@@ -17795,7 +17461,7 @@
       <w:contextualSpacing/>
     </w:pPr>
   </w:style>
-  <w:style w:type="paragraph" w:styleId="Lista2">
+  <w:style w:type="paragraph" w:styleId="List2">
     <w:name w:val="List 2"/>
     <w:basedOn w:val="Normal"/>
     <w:uiPriority w:val="99"/>
@@ -17806,10 +17472,10 @@
       <w:contextualSpacing/>
     </w:pPr>
   </w:style>
-  <w:style w:type="paragraph" w:styleId="Cierre">
+  <w:style w:type="paragraph" w:styleId="Closing">
     <w:name w:val="Closing"/>
     <w:basedOn w:val="Normal"/>
-    <w:link w:val="CierreCar"/>
+    <w:link w:val="ClosingChar"/>
     <w:uiPriority w:val="99"/>
     <w:unhideWhenUsed/>
     <w:rsid w:val="00973EA1"/>
@@ -17818,20 +17484,20 @@
       <w:ind w:left="4252"/>
     </w:pPr>
   </w:style>
-  <w:style w:type="character" w:customStyle="1" w:styleId="CierreCar">
-    <w:name w:val="Cierre Car"/>
-    <w:basedOn w:val="Fuentedeprrafopredeter"/>
-    <w:link w:val="Cierre"/>
+  <w:style w:type="character" w:customStyle="1" w:styleId="ClosingChar">
+    <w:name w:val="Closing Char"/>
+    <w:basedOn w:val="DefaultParagraphFont"/>
+    <w:link w:val="Closing"/>
     <w:uiPriority w:val="99"/>
     <w:rsid w:val="00973EA1"/>
     <w:rPr>
       <w:rFonts w:ascii="Times New Roman" w:hAnsi="Times New Roman"/>
     </w:rPr>
   </w:style>
-  <w:style w:type="paragraph" w:styleId="Textoindependienteprimerasangra">
+  <w:style w:type="paragraph" w:styleId="BodyTextFirstIndent">
     <w:name w:val="Body Text First Indent"/>
-    <w:basedOn w:val="Textoindependiente"/>
-    <w:link w:val="TextoindependienteprimerasangraCar"/>
+    <w:basedOn w:val="BodyText"/>
+    <w:link w:val="BodyTextFirstIndentChar"/>
     <w:uiPriority w:val="99"/>
     <w:unhideWhenUsed/>
     <w:rsid w:val="00973EA1"/>
@@ -17845,10 +17511,10 @@
       <w:szCs w:val="22"/>
     </w:rPr>
   </w:style>
-  <w:style w:type="character" w:customStyle="1" w:styleId="TextoindependienteprimerasangraCar">
-    <w:name w:val="Texto independiente primera sangría Car"/>
-    <w:basedOn w:val="TextoindependienteCar"/>
-    <w:link w:val="Textoindependienteprimerasangra"/>
+  <w:style w:type="character" w:customStyle="1" w:styleId="BodyTextFirstIndentChar">
+    <w:name w:val="Body Text First Indent Char"/>
+    <w:basedOn w:val="BodyTextChar"/>
+    <w:link w:val="BodyTextFirstIndent"/>
     <w:uiPriority w:val="99"/>
     <w:rsid w:val="00973EA1"/>
     <w:rPr>
@@ -17860,8 +17526,8 @@
   </w:style>
   <w:style w:type="table" w:customStyle="1" w:styleId="Tablaconcuadrcula2">
     <w:name w:val="Tabla con cuadrícula2"/>
-    <w:basedOn w:val="Tablanormal"/>
-    <w:next w:val="Tablaconcuadrcula"/>
+    <w:basedOn w:val="TableNormal"/>
+    <w:next w:val="TableGrid"/>
     <w:uiPriority w:val="59"/>
     <w:rsid w:val="00105DD4"/>
     <w:pPr>
@@ -17910,8 +17576,8 @@
   </w:style>
   <w:style w:type="table" w:customStyle="1" w:styleId="Tablaconcuadrcula3">
     <w:name w:val="Tabla con cuadrícula3"/>
-    <w:basedOn w:val="Tablanormal"/>
-    <w:next w:val="Tablaconcuadrcula"/>
+    <w:basedOn w:val="TableNormal"/>
+    <w:next w:val="TableGrid"/>
     <w:uiPriority w:val="59"/>
     <w:rsid w:val="00105DD4"/>
     <w:pPr>
@@ -18197,28 +17863,28 @@
 </file>
 
 <file path=customXml/item1.xml><?xml version="1.0" encoding="utf-8"?>
-<b:Sources xmlns:b="http://schemas.openxmlformats.org/officeDocument/2006/bibliography" xmlns="http://schemas.openxmlformats.org/officeDocument/2006/bibliography" SelectedStyle="\APASixthEditionOfficeOnline.xsl" StyleName="APA" Version="6"/>
-</file>
-
-<file path=customXml/item2.xml><?xml version="1.0" encoding="utf-8"?>
 <go:gDocsCustomXmlDataStorage xmlns:go="http://customooxmlschemas.google.com/" xmlns:r="http://schemas.openxmlformats.org/officeDocument/2006/relationships">
   <go:docsCustomData xmlns:go="http://customooxmlschemas.google.com/" roundtripDataSignature="AMtx7mhzdpfn1finIqKXU+1UPIfU21OW1Q==">AMUW2mVvpZPnv5te96KCzqdpwIhLXEqqDf1Jm/Jsn5xfICjpf7+cLx66Pg3Z6OyclqamRuaI6NzxVfznks8qzXgq6Shzb3AvxFhRa3ikUeQpf55ToVd72oiAa63NjuOKhuLrTUBAwX7TxT6/jKPCkAwx81Cl/siheji2glXXaNE6LOUNE4D+R7OYEQfFjaKo2CzTlnGc1WEdiQoLVoiQnpq1QlduKazjn1jsN2tZpEvoXRVNcjxJejMHEr/s7YsU4SRSZf/CGJlMizcgpazttZ88EnKSbtK2kaxsLvT+ygQ6Nt698VUDGYk4KHB27iDAg6aqb4m7SIwK</go:docsCustomData>
 </go:gDocsCustomXmlDataStorage>
 </file>
 
-<file path=customXml/itemProps1.xml><?xml version="1.0" encoding="utf-8"?>
-<ds:datastoreItem xmlns:ds="http://schemas.openxmlformats.org/officeDocument/2006/customXml" ds:itemID="{373DA788-535C-4842-9536-B8D15A43118A}">
-  <ds:schemaRefs>
-    <ds:schemaRef ds:uri="http://schemas.openxmlformats.org/officeDocument/2006/bibliography"/>
-  </ds:schemaRefs>
-</ds:datastoreItem>
+<file path=customXml/item2.xml><?xml version="1.0" encoding="utf-8"?>
+<b:Sources xmlns:b="http://schemas.openxmlformats.org/officeDocument/2006/bibliography" xmlns="http://schemas.openxmlformats.org/officeDocument/2006/bibliography" SelectedStyle="\APASixthEditionOfficeOnline.xsl" StyleName="APA" Version="6"/>
 </file>
 
-<file path=customXml/itemProps2.xml><?xml version="1.0" encoding="utf-8"?>
+<file path=customXml/itemProps1.xml><?xml version="1.0" encoding="utf-8"?>
 <ds:datastoreItem xmlns:ds="http://schemas.openxmlformats.org/officeDocument/2006/customXml" ds:itemID="{11111111-1234-1234-1234-123412341234}">
   <ds:schemaRefs>
     <ds:schemaRef ds:uri="http://customooxmlschemas.google.com/"/>
     <ds:schemaRef ds:uri="http://schemas.openxmlformats.org/officeDocument/2006/relationships"/>
   </ds:schemaRefs>
 </ds:datastoreItem>
+</file>
+
+<file path=customXml/itemProps2.xml><?xml version="1.0" encoding="utf-8"?>
+<ds:datastoreItem xmlns:ds="http://schemas.openxmlformats.org/officeDocument/2006/customXml" ds:itemID="{373DA788-535C-4842-9536-B8D15A43118A}">
+  <ds:schemaRefs>
+    <ds:schemaRef ds:uri="http://schemas.openxmlformats.org/officeDocument/2006/bibliography"/>
+  </ds:schemaRefs>
+</ds:datastoreItem>
 </file>
</xml_diff>